<commit_message>
adding class-diag (was removed)
</commit_message>
<xml_diff>
--- a/usman-21/Usman Ahmad #21 SRS ShoeCommerce.docx
+++ b/usman-21/Usman Ahmad #21 SRS ShoeCommerce.docx
@@ -316,7 +316,7 @@
                                           <w:sz w:val="108"/>
                                           <w:szCs w:val="108"/>
                                         </w:rPr>
-                                        <w:t>ShoeCommerce</w:t>
+                                        <w:t>Shoes E-commerce system</w:t>
                                       </w:r>
                                     </w:p>
                                   </w:sdtContent>
@@ -551,7 +551,7 @@
                                     <w:sz w:val="108"/>
                                     <w:szCs w:val="108"/>
                                   </w:rPr>
-                                  <w:t>ShoeCommerce</w:t>
+                                  <w:t>Shoes E-commerce system</w:t>
                                 </w:r>
                               </w:p>
                             </w:sdtContent>
@@ -4057,7 +4057,6 @@
         </w:rPr>
       </w:pPr>
       <w:bookmarkStart w:id="5" w:name="_Toc216737955"/>
-      <w:proofErr w:type="gramStart"/>
       <w:r>
         <w:rPr>
           <w:sz w:val="28"/>
@@ -4066,7 +4065,6 @@
         <w:t>1.1  Purpose</w:t>
       </w:r>
       <w:bookmarkEnd w:id="5"/>
-      <w:proofErr w:type="gramEnd"/>
       <w:r>
         <w:rPr>
           <w:sz w:val="28"/>
@@ -4135,7 +4133,6 @@
         </w:rPr>
       </w:pPr>
       <w:bookmarkStart w:id="6" w:name="_Toc216737956"/>
-      <w:proofErr w:type="gramStart"/>
       <w:r>
         <w:rPr>
           <w:sz w:val="28"/>
@@ -4144,7 +4141,6 @@
         <w:t>1.2  Scope</w:t>
       </w:r>
       <w:bookmarkEnd w:id="6"/>
-      <w:proofErr w:type="gramEnd"/>
       <w:r>
         <w:rPr>
           <w:sz w:val="28"/>
@@ -4179,25 +4175,7 @@
           <w:szCs w:val="24"/>
         </w:rPr>
         <w:lastRenderedPageBreak/>
-        <w:t xml:space="preserve">searching products, and filtering by brand, size, price, and color. Each product page shows details, images, price, and available sizes. Users can add items to their cart, update quantities, manage a </w:t>
-      </w:r>
-      <w:proofErr w:type="spellStart"/>
-      <w:r>
-        <w:rPr>
-          <w:rFonts w:asciiTheme="majorBidi" w:hAnsiTheme="majorBidi" w:cstheme="majorBidi"/>
-          <w:sz w:val="24"/>
-          <w:szCs w:val="24"/>
-        </w:rPr>
-        <w:t>wishlist</w:t>
-      </w:r>
-      <w:proofErr w:type="spellEnd"/>
-      <w:r>
-        <w:rPr>
-          <w:rFonts w:asciiTheme="majorBidi" w:hAnsiTheme="majorBidi" w:cstheme="majorBidi"/>
-          <w:sz w:val="24"/>
-          <w:szCs w:val="24"/>
-        </w:rPr>
-        <w:t>, proceed to secure checkout using Stripe, track order status, and view order history.</w:t>
+        <w:t>searching products, and filtering by brand, size, price, and color. Each product page shows details, images, price, and available sizes. Users can add items to their cart, update quantities, manage a wishlist, proceed to secure checkout using Stripe, track order status, and view order history.</w:t>
       </w:r>
     </w:p>
     <w:p>
@@ -4229,21 +4207,12 @@
         </w:rPr>
       </w:pPr>
       <w:bookmarkStart w:id="7" w:name="_Toc216737957"/>
-      <w:proofErr w:type="gramStart"/>
       <w:r>
         <w:rPr>
           <w:sz w:val="28"/>
           <w:szCs w:val="28"/>
         </w:rPr>
-        <w:t>1.3  Definitions</w:t>
-      </w:r>
-      <w:proofErr w:type="gramEnd"/>
-      <w:r>
-        <w:rPr>
-          <w:sz w:val="28"/>
-          <w:szCs w:val="28"/>
-        </w:rPr>
-        <w:t>, Acronyms, and Abbreviations.</w:t>
+        <w:t>1.3  Definitions, Acronyms, and Abbreviations.</w:t>
       </w:r>
       <w:bookmarkEnd w:id="7"/>
       <w:r>
@@ -4674,7 +4643,6 @@
         </w:rPr>
       </w:pPr>
       <w:bookmarkStart w:id="8" w:name="_Toc216737958"/>
-      <w:proofErr w:type="gramStart"/>
       <w:r>
         <w:rPr>
           <w:sz w:val="28"/>
@@ -4683,7 +4651,6 @@
         <w:t>1.4  References</w:t>
       </w:r>
       <w:bookmarkEnd w:id="8"/>
-      <w:proofErr w:type="gramEnd"/>
       <w:r>
         <w:rPr>
           <w:sz w:val="28"/>
@@ -4757,7 +4724,6 @@
         </w:rPr>
       </w:pPr>
       <w:bookmarkStart w:id="9" w:name="_Toc216737959"/>
-      <w:proofErr w:type="gramStart"/>
       <w:r>
         <w:rPr>
           <w:sz w:val="28"/>
@@ -4766,7 +4732,6 @@
         <w:t>1.5  Overview</w:t>
       </w:r>
       <w:bookmarkEnd w:id="9"/>
-      <w:proofErr w:type="gramEnd"/>
       <w:r>
         <w:rPr>
           <w:sz w:val="28"/>
@@ -5173,25 +5138,7 @@
           <w:sz w:val="24"/>
           <w:szCs w:val="24"/>
         </w:rPr>
-        <w:t xml:space="preserve">ShoeCommerce is a standalone, web-based e-commerce platform designed for buying and selling shoes online. It operates independently and does not rely on any existing systems. The platform has two main modules: the User Module and the Admin Module. The User Module allows customers to register, verify their account, manage profiles, browse products, apply filters, add items to a cart or </w:t>
-      </w:r>
-      <w:proofErr w:type="spellStart"/>
-      <w:r>
-        <w:rPr>
-          <w:rFonts w:ascii="Times New Roman" w:eastAsia="Times New Roman" w:hAnsi="Times New Roman" w:cs="Times New Roman"/>
-          <w:sz w:val="24"/>
-          <w:szCs w:val="24"/>
-        </w:rPr>
-        <w:t>wishlist</w:t>
-      </w:r>
-      <w:proofErr w:type="spellEnd"/>
-      <w:r>
-        <w:rPr>
-          <w:rFonts w:ascii="Times New Roman" w:eastAsia="Times New Roman" w:hAnsi="Times New Roman" w:cs="Times New Roman"/>
-          <w:sz w:val="24"/>
-          <w:szCs w:val="24"/>
-        </w:rPr>
-        <w:t>, complete checkout, and track orders. The Admin Module provides tools for managing products, categories, inventory, users, orders, and generating sales reports. The platform interacts with external services such as the Stripe payment gateway for processing online payments and an email service for user account verification.</w:t>
+        <w:t>ShoeCommerce is a standalone, web-based e-commerce platform designed for buying and selling shoes online. It operates independently and does not rely on any existing systems. The platform has two main modules: the User Module and the Admin Module. The User Module allows customers to register, verify their account, manage profiles, browse products, apply filters, add items to a cart or wishlist, complete checkout, and track orders. The Admin Module provides tools for managing products, categories, inventory, users, orders, and generating sales reports. The platform interacts with external services such as the Stripe payment gateway for processing online payments and an email service for user account verification.</w:t>
       </w:r>
     </w:p>
     <w:p>
@@ -5240,15 +5187,7 @@
         <w:t>User Operations:</w:t>
       </w:r>
       <w:r>
-        <w:t xml:space="preserve"> Registration, account verification via email, login/logout, profile management, product browsing, applying filters, managing </w:t>
-      </w:r>
-      <w:proofErr w:type="spellStart"/>
-      <w:r>
-        <w:t>wishlist</w:t>
-      </w:r>
-      <w:proofErr w:type="spellEnd"/>
-      <w:r>
-        <w:t xml:space="preserve"> and shopping cart, checkout, and tracking order status.</w:t>
+        <w:t xml:space="preserve"> Registration, account verification via email, login/logout, profile management, product browsing, applying filters, managing wishlist and shopping cart, checkout, and tracking order status.</w:t>
       </w:r>
     </w:p>
     <w:p>
@@ -5295,15 +5234,7 @@
         <w:t>Shopping Cart &amp; Wishlist:</w:t>
       </w:r>
       <w:r>
-        <w:t xml:space="preserve"> Users can add items to their cart, modify quantities, remove items, or save items to a </w:t>
-      </w:r>
-      <w:proofErr w:type="spellStart"/>
-      <w:r>
-        <w:t>wishlist</w:t>
-      </w:r>
-      <w:proofErr w:type="spellEnd"/>
-      <w:r>
-        <w:t>.</w:t>
+        <w:t xml:space="preserve"> Users can add items to their cart, modify quantities, remove items, or save items to a wishlist.</w:t>
       </w:r>
     </w:p>
     <w:p>
@@ -5561,25 +5492,7 @@
           <w:b w:val="0"/>
           <w:bCs w:val="0"/>
         </w:rPr>
-        <w:t xml:space="preserve"> Add items to cart, update quantity, remove items, and save favorites in </w:t>
-      </w:r>
-      <w:proofErr w:type="spellStart"/>
-      <w:r>
-        <w:rPr>
-          <w:rStyle w:val="Strong"/>
-          <w:b w:val="0"/>
-          <w:bCs w:val="0"/>
-        </w:rPr>
-        <w:t>wishlist</w:t>
-      </w:r>
-      <w:proofErr w:type="spellEnd"/>
-      <w:r>
-        <w:rPr>
-          <w:rStyle w:val="Strong"/>
-          <w:b w:val="0"/>
-          <w:bCs w:val="0"/>
-        </w:rPr>
-        <w:t>.</w:t>
+        <w:t xml:space="preserve"> Add items to cart, update quantity, remove items, and save favorites in wishlist.</w:t>
       </w:r>
     </w:p>
     <w:p>
@@ -6954,25 +6867,7 @@
           <w:sz w:val="24"/>
           <w:szCs w:val="24"/>
         </w:rPr>
-        <w:t xml:space="preserve">Users can sign up, log in, browse products, upload profiles, manage carts, </w:t>
-      </w:r>
-      <w:proofErr w:type="spellStart"/>
-      <w:r>
-        <w:rPr>
-          <w:rFonts w:ascii="Times New Roman" w:eastAsia="Times New Roman" w:hAnsi="Times New Roman" w:cs="Times New Roman"/>
-          <w:sz w:val="24"/>
-          <w:szCs w:val="24"/>
-        </w:rPr>
-        <w:t>wishlists</w:t>
-      </w:r>
-      <w:proofErr w:type="spellEnd"/>
-      <w:r>
-        <w:rPr>
-          <w:rFonts w:ascii="Times New Roman" w:eastAsia="Times New Roman" w:hAnsi="Times New Roman" w:cs="Times New Roman"/>
-          <w:sz w:val="24"/>
-          <w:szCs w:val="24"/>
-        </w:rPr>
-        <w:t>, and complete checkout.</w:t>
+        <w:t>Users can sign up, log in, browse products, upload profiles, manage carts, wishlists, and complete checkout.</w:t>
       </w:r>
     </w:p>
     <w:p>
@@ -10214,25 +10109,7 @@
           <w:szCs w:val="24"/>
         </w:rPr>
         <w:br/>
-        <w:t>Users can browse products, search, filter, view details, and manage cart/</w:t>
-      </w:r>
-      <w:proofErr w:type="spellStart"/>
-      <w:r>
-        <w:rPr>
-          <w:rFonts w:asciiTheme="majorBidi" w:eastAsia="Times New Roman" w:hAnsiTheme="majorBidi" w:cstheme="majorBidi"/>
-          <w:sz w:val="24"/>
-          <w:szCs w:val="24"/>
-        </w:rPr>
-        <w:t>wishlist</w:t>
-      </w:r>
-      <w:proofErr w:type="spellEnd"/>
-      <w:r>
-        <w:rPr>
-          <w:rFonts w:asciiTheme="majorBidi" w:eastAsia="Times New Roman" w:hAnsiTheme="majorBidi" w:cstheme="majorBidi"/>
-          <w:sz w:val="24"/>
-          <w:szCs w:val="24"/>
-        </w:rPr>
-        <w:t>.</w:t>
+        <w:t>Users can browse products, search, filter, view details, and manage cart/wishlist.</w:t>
       </w:r>
     </w:p>
     <w:p>
@@ -10335,25 +10212,7 @@
           <w:sz w:val="24"/>
           <w:szCs w:val="24"/>
         </w:rPr>
-        <w:t>Add-to-cart/</w:t>
-      </w:r>
-      <w:proofErr w:type="spellStart"/>
-      <w:r>
-        <w:rPr>
-          <w:rFonts w:asciiTheme="majorBidi" w:eastAsia="Times New Roman" w:hAnsiTheme="majorBidi" w:cstheme="majorBidi"/>
-          <w:sz w:val="24"/>
-          <w:szCs w:val="24"/>
-        </w:rPr>
-        <w:t>wishlist</w:t>
-      </w:r>
-      <w:proofErr w:type="spellEnd"/>
-      <w:r>
-        <w:rPr>
-          <w:rFonts w:asciiTheme="majorBidi" w:eastAsia="Times New Roman" w:hAnsiTheme="majorBidi" w:cstheme="majorBidi"/>
-          <w:sz w:val="24"/>
-          <w:szCs w:val="24"/>
-        </w:rPr>
-        <w:t xml:space="preserve"> actions</w:t>
+        <w:t>Add-to-cart/wishlist actions</w:t>
       </w:r>
     </w:p>
     <w:p>
@@ -10415,18 +10274,8 @@
           <w:szCs w:val="24"/>
         </w:rPr>
         <w:lastRenderedPageBreak/>
-        <w:t>Update cart/</w:t>
-      </w:r>
-      <w:proofErr w:type="spellStart"/>
-      <w:r>
-        <w:rPr>
-          <w:rFonts w:asciiTheme="majorBidi" w:eastAsia="Times New Roman" w:hAnsiTheme="majorBidi" w:cstheme="majorBidi"/>
-          <w:sz w:val="24"/>
-          <w:szCs w:val="24"/>
-        </w:rPr>
-        <w:t>wishlist</w:t>
-      </w:r>
-      <w:proofErr w:type="spellEnd"/>
+        <w:t>Update cart/wishlist</w:t>
+      </w:r>
     </w:p>
     <w:p>
       <w:pPr>
@@ -11103,25 +10952,7 @@
           <w:sz w:val="24"/>
           <w:szCs w:val="24"/>
         </w:rPr>
-        <w:t xml:space="preserve">Update </w:t>
-      </w:r>
-      <w:proofErr w:type="spellStart"/>
-      <w:r>
-        <w:rPr>
-          <w:rFonts w:asciiTheme="majorBidi" w:eastAsia="Times New Roman" w:hAnsiTheme="majorBidi" w:cstheme="majorBidi"/>
-          <w:sz w:val="24"/>
-          <w:szCs w:val="24"/>
-        </w:rPr>
-        <w:t>wishlist</w:t>
-      </w:r>
-      <w:proofErr w:type="spellEnd"/>
-      <w:r>
-        <w:rPr>
-          <w:rFonts w:asciiTheme="majorBidi" w:eastAsia="Times New Roman" w:hAnsiTheme="majorBidi" w:cstheme="majorBidi"/>
-          <w:sz w:val="24"/>
-          <w:szCs w:val="24"/>
-        </w:rPr>
-        <w:t xml:space="preserve"> in database</w:t>
+        <w:t>Update wishlist in database</w:t>
       </w:r>
     </w:p>
     <w:p>
@@ -11161,25 +10992,7 @@
           <w:sz w:val="24"/>
           <w:szCs w:val="24"/>
         </w:rPr>
-        <w:t xml:space="preserve">Updated </w:t>
-      </w:r>
-      <w:proofErr w:type="spellStart"/>
-      <w:r>
-        <w:rPr>
-          <w:rFonts w:asciiTheme="majorBidi" w:eastAsia="Times New Roman" w:hAnsiTheme="majorBidi" w:cstheme="majorBidi"/>
-          <w:sz w:val="24"/>
-          <w:szCs w:val="24"/>
-        </w:rPr>
-        <w:t>wishlist</w:t>
-      </w:r>
-      <w:proofErr w:type="spellEnd"/>
-      <w:r>
-        <w:rPr>
-          <w:rFonts w:asciiTheme="majorBidi" w:eastAsia="Times New Roman" w:hAnsiTheme="majorBidi" w:cstheme="majorBidi"/>
-          <w:sz w:val="24"/>
-          <w:szCs w:val="24"/>
-        </w:rPr>
-        <w:t xml:space="preserve"> display</w:t>
+        <w:t>Updated wishlist display</w:t>
       </w:r>
     </w:p>
     <w:p>
@@ -15677,25 +15490,7 @@
                 <w:szCs w:val="24"/>
               </w:rPr>
               <w:br/>
-              <w:t xml:space="preserve">4. User clicks link and </w:t>
-            </w:r>
-            <w:proofErr w:type="gramStart"/>
-            <w:r>
-              <w:rPr>
-                <w:rFonts w:asciiTheme="majorBidi" w:hAnsiTheme="majorBidi" w:cstheme="majorBidi"/>
-                <w:sz w:val="24"/>
-                <w:szCs w:val="24"/>
-              </w:rPr>
-              <w:t>enters</w:t>
-            </w:r>
-            <w:proofErr w:type="gramEnd"/>
-            <w:r>
-              <w:rPr>
-                <w:rFonts w:asciiTheme="majorBidi" w:hAnsiTheme="majorBidi" w:cstheme="majorBidi"/>
-                <w:sz w:val="24"/>
-                <w:szCs w:val="24"/>
-              </w:rPr>
-              <w:t xml:space="preserve"> new password.</w:t>
+              <w:t>4. User clicks link and enters new password.</w:t>
             </w:r>
             <w:r>
               <w:rPr>
@@ -20759,25 +20554,7 @@
                 <w:sz w:val="24"/>
                 <w:szCs w:val="24"/>
               </w:rPr>
-              <w:t xml:space="preserve">User adds a product to their </w:t>
-            </w:r>
-            <w:proofErr w:type="spellStart"/>
-            <w:r>
-              <w:rPr>
-                <w:rFonts w:asciiTheme="majorBidi" w:hAnsiTheme="majorBidi" w:cstheme="majorBidi"/>
-                <w:sz w:val="24"/>
-                <w:szCs w:val="24"/>
-              </w:rPr>
-              <w:t>wishlist</w:t>
-            </w:r>
-            <w:proofErr w:type="spellEnd"/>
-            <w:r>
-              <w:rPr>
-                <w:rFonts w:asciiTheme="majorBidi" w:hAnsiTheme="majorBidi" w:cstheme="majorBidi"/>
-                <w:sz w:val="24"/>
-                <w:szCs w:val="24"/>
-              </w:rPr>
-              <w:t xml:space="preserve"> for future purchase.</w:t>
+              <w:t>User adds a product to their wishlist for future purchase.</w:t>
             </w:r>
           </w:p>
         </w:tc>
@@ -20893,25 +20670,7 @@
                 <w:sz w:val="24"/>
                 <w:szCs w:val="24"/>
               </w:rPr>
-              <w:t xml:space="preserve">Product added to </w:t>
-            </w:r>
-            <w:proofErr w:type="spellStart"/>
-            <w:r>
-              <w:rPr>
-                <w:rFonts w:asciiTheme="majorBidi" w:hAnsiTheme="majorBidi" w:cstheme="majorBidi"/>
-                <w:sz w:val="24"/>
-                <w:szCs w:val="24"/>
-              </w:rPr>
-              <w:t>wishlist</w:t>
-            </w:r>
-            <w:proofErr w:type="spellEnd"/>
-            <w:r>
-              <w:rPr>
-                <w:rFonts w:asciiTheme="majorBidi" w:hAnsiTheme="majorBidi" w:cstheme="majorBidi"/>
-                <w:sz w:val="24"/>
-                <w:szCs w:val="24"/>
-              </w:rPr>
-              <w:t>.</w:t>
+              <w:t>Product added to wishlist.</w:t>
             </w:r>
           </w:p>
         </w:tc>
@@ -20978,25 +20737,7 @@
                 <w:szCs w:val="24"/>
               </w:rPr>
               <w:br/>
-              <w:t xml:space="preserve">2. System updates </w:t>
-            </w:r>
-            <w:proofErr w:type="spellStart"/>
-            <w:r>
-              <w:rPr>
-                <w:rFonts w:asciiTheme="majorBidi" w:hAnsiTheme="majorBidi" w:cstheme="majorBidi"/>
-                <w:sz w:val="24"/>
-                <w:szCs w:val="24"/>
-              </w:rPr>
-              <w:t>wishlist</w:t>
-            </w:r>
-            <w:proofErr w:type="spellEnd"/>
-            <w:r>
-              <w:rPr>
-                <w:rFonts w:asciiTheme="majorBidi" w:hAnsiTheme="majorBidi" w:cstheme="majorBidi"/>
-                <w:sz w:val="24"/>
-                <w:szCs w:val="24"/>
-              </w:rPr>
-              <w:t xml:space="preserve"> database.</w:t>
+              <w:t>2. System updates wishlist database.</w:t>
             </w:r>
             <w:r>
               <w:rPr>
@@ -21378,25 +21119,7 @@
                 <w:sz w:val="24"/>
                 <w:szCs w:val="24"/>
               </w:rPr>
-              <w:t xml:space="preserve">User removes a product from the </w:t>
-            </w:r>
-            <w:proofErr w:type="spellStart"/>
-            <w:r>
-              <w:rPr>
-                <w:rFonts w:asciiTheme="majorBidi" w:hAnsiTheme="majorBidi" w:cstheme="majorBidi"/>
-                <w:sz w:val="24"/>
-                <w:szCs w:val="24"/>
-              </w:rPr>
-              <w:t>wishlist</w:t>
-            </w:r>
-            <w:proofErr w:type="spellEnd"/>
-            <w:r>
-              <w:rPr>
-                <w:rFonts w:asciiTheme="majorBidi" w:hAnsiTheme="majorBidi" w:cstheme="majorBidi"/>
-                <w:sz w:val="24"/>
-                <w:szCs w:val="24"/>
-              </w:rPr>
-              <w:t>.</w:t>
+              <w:t>User removes a product from the wishlist.</w:t>
             </w:r>
           </w:p>
         </w:tc>
@@ -21454,25 +21177,7 @@
                 <w:sz w:val="24"/>
                 <w:szCs w:val="24"/>
               </w:rPr>
-              <w:t xml:space="preserve">Product exists in </w:t>
-            </w:r>
-            <w:proofErr w:type="spellStart"/>
-            <w:r>
-              <w:rPr>
-                <w:rFonts w:asciiTheme="majorBidi" w:hAnsiTheme="majorBidi" w:cstheme="majorBidi"/>
-                <w:sz w:val="24"/>
-                <w:szCs w:val="24"/>
-              </w:rPr>
-              <w:t>wishlist</w:t>
-            </w:r>
-            <w:proofErr w:type="spellEnd"/>
-            <w:r>
-              <w:rPr>
-                <w:rFonts w:asciiTheme="majorBidi" w:hAnsiTheme="majorBidi" w:cstheme="majorBidi"/>
-                <w:sz w:val="24"/>
-                <w:szCs w:val="24"/>
-              </w:rPr>
-              <w:t>.</w:t>
+              <w:t>Product exists in wishlist.</w:t>
             </w:r>
           </w:p>
         </w:tc>
@@ -21530,25 +21235,7 @@
                 <w:sz w:val="24"/>
                 <w:szCs w:val="24"/>
               </w:rPr>
-              <w:t xml:space="preserve">Product removed from </w:t>
-            </w:r>
-            <w:proofErr w:type="spellStart"/>
-            <w:r>
-              <w:rPr>
-                <w:rFonts w:asciiTheme="majorBidi" w:hAnsiTheme="majorBidi" w:cstheme="majorBidi"/>
-                <w:sz w:val="24"/>
-                <w:szCs w:val="24"/>
-              </w:rPr>
-              <w:t>wishlist</w:t>
-            </w:r>
-            <w:proofErr w:type="spellEnd"/>
-            <w:r>
-              <w:rPr>
-                <w:rFonts w:asciiTheme="majorBidi" w:hAnsiTheme="majorBidi" w:cstheme="majorBidi"/>
-                <w:sz w:val="24"/>
-                <w:szCs w:val="24"/>
-              </w:rPr>
-              <w:t>.</w:t>
+              <w:t>Product removed from wishlist.</w:t>
             </w:r>
           </w:p>
         </w:tc>
@@ -25425,25 +25112,7 @@
                 <w:sz w:val="24"/>
                 <w:szCs w:val="24"/>
               </w:rPr>
-              <w:t xml:space="preserve">User receives notifications about order updates or </w:t>
-            </w:r>
-            <w:proofErr w:type="spellStart"/>
-            <w:r>
-              <w:rPr>
-                <w:rFonts w:asciiTheme="majorBidi" w:hAnsiTheme="majorBidi" w:cstheme="majorBidi"/>
-                <w:sz w:val="24"/>
-                <w:szCs w:val="24"/>
-              </w:rPr>
-              <w:t>wishlist</w:t>
-            </w:r>
-            <w:proofErr w:type="spellEnd"/>
-            <w:r>
-              <w:rPr>
-                <w:rFonts w:asciiTheme="majorBidi" w:hAnsiTheme="majorBidi" w:cstheme="majorBidi"/>
-                <w:sz w:val="24"/>
-                <w:szCs w:val="24"/>
-              </w:rPr>
-              <w:t xml:space="preserve"> changes.</w:t>
+              <w:t>User receives notifications about order updates or wishlist changes.</w:t>
             </w:r>
           </w:p>
         </w:tc>
@@ -25501,25 +25170,7 @@
                 <w:sz w:val="24"/>
                 <w:szCs w:val="24"/>
               </w:rPr>
-              <w:t>User is logged in and has orders/</w:t>
-            </w:r>
-            <w:proofErr w:type="spellStart"/>
-            <w:r>
-              <w:rPr>
-                <w:rFonts w:asciiTheme="majorBidi" w:hAnsiTheme="majorBidi" w:cstheme="majorBidi"/>
-                <w:sz w:val="24"/>
-                <w:szCs w:val="24"/>
-              </w:rPr>
-              <w:t>wishlist</w:t>
-            </w:r>
-            <w:proofErr w:type="spellEnd"/>
-            <w:r>
-              <w:rPr>
-                <w:rFonts w:asciiTheme="majorBidi" w:hAnsiTheme="majorBidi" w:cstheme="majorBidi"/>
-                <w:sz w:val="24"/>
-                <w:szCs w:val="24"/>
-              </w:rPr>
-              <w:t xml:space="preserve"> items.</w:t>
+              <w:t>User is logged in and has orders/wishlist items.</w:t>
             </w:r>
           </w:p>
         </w:tc>
@@ -33221,38 +32872,12 @@
           <w:numId w:val="39"/>
         </w:numPr>
       </w:pPr>
-      <w:proofErr w:type="spellStart"/>
       <w:r>
         <w:t>u</w:t>
       </w:r>
       <w:r>
-        <w:t>ser_id</w:t>
-      </w:r>
-      <w:proofErr w:type="spellEnd"/>
-      <w:r>
-        <w:t xml:space="preserve">, name, email, password, phone, </w:t>
-      </w:r>
-      <w:proofErr w:type="spellStart"/>
-      <w:r>
-        <w:t>shipping_address</w:t>
-      </w:r>
-      <w:proofErr w:type="spellEnd"/>
-      <w:r>
-        <w:t xml:space="preserve">, </w:t>
-      </w:r>
-      <w:proofErr w:type="spellStart"/>
-      <w:r>
-        <w:t>order_history</w:t>
-      </w:r>
-      <w:proofErr w:type="spellEnd"/>
-      <w:r>
-        <w:t xml:space="preserve">, </w:t>
-      </w:r>
-      <w:proofErr w:type="spellStart"/>
-      <w:r>
-        <w:t>wishlist</w:t>
-      </w:r>
-      <w:proofErr w:type="spellEnd"/>
+        <w:t>ser_id, name, email, password, phone, shipping_address, order_history, wishlist</w:t>
+      </w:r>
     </w:p>
     <w:p>
       <w:pPr>
@@ -33283,94 +32908,8 @@
           <w:numId w:val="91"/>
         </w:numPr>
       </w:pPr>
-      <w:proofErr w:type="gramStart"/>
-      <w:r>
-        <w:t>register(</w:t>
-      </w:r>
-      <w:proofErr w:type="gramEnd"/>
-      <w:r>
-        <w:t xml:space="preserve">), </w:t>
-      </w:r>
-      <w:proofErr w:type="gramStart"/>
-      <w:r>
-        <w:t>login(</w:t>
-      </w:r>
-      <w:proofErr w:type="gramEnd"/>
-      <w:r>
-        <w:t xml:space="preserve">), </w:t>
-      </w:r>
-      <w:proofErr w:type="gramStart"/>
-      <w:r>
-        <w:t>logout(</w:t>
-      </w:r>
-      <w:proofErr w:type="gramEnd"/>
-      <w:r>
-        <w:t xml:space="preserve">), </w:t>
-      </w:r>
-      <w:proofErr w:type="spellStart"/>
-      <w:proofErr w:type="gramStart"/>
-      <w:r>
-        <w:t>updateProfile</w:t>
-      </w:r>
-      <w:proofErr w:type="spellEnd"/>
-      <w:r>
-        <w:t>(</w:t>
-      </w:r>
-      <w:proofErr w:type="gramEnd"/>
-      <w:r>
-        <w:t xml:space="preserve">), </w:t>
-      </w:r>
-      <w:proofErr w:type="spellStart"/>
-      <w:proofErr w:type="gramStart"/>
-      <w:r>
-        <w:t>viewProfile</w:t>
-      </w:r>
-      <w:proofErr w:type="spellEnd"/>
-      <w:r>
-        <w:t>(</w:t>
-      </w:r>
-      <w:proofErr w:type="gramEnd"/>
-      <w:r>
-        <w:t xml:space="preserve">), </w:t>
-      </w:r>
-      <w:proofErr w:type="spellStart"/>
-      <w:proofErr w:type="gramStart"/>
-      <w:r>
-        <w:t>addToCart</w:t>
-      </w:r>
-      <w:proofErr w:type="spellEnd"/>
-      <w:r>
-        <w:t>(</w:t>
-      </w:r>
-      <w:proofErr w:type="gramEnd"/>
-      <w:r>
-        <w:t xml:space="preserve">), </w:t>
-      </w:r>
-      <w:proofErr w:type="spellStart"/>
-      <w:proofErr w:type="gramStart"/>
-      <w:r>
-        <w:t>manageWishlist</w:t>
-      </w:r>
-      <w:proofErr w:type="spellEnd"/>
-      <w:r>
-        <w:t>(</w:t>
-      </w:r>
-      <w:proofErr w:type="gramEnd"/>
-      <w:r>
-        <w:t xml:space="preserve">), </w:t>
-      </w:r>
-      <w:proofErr w:type="spellStart"/>
-      <w:proofErr w:type="gramStart"/>
-      <w:r>
-        <w:t>viewOrderHistory</w:t>
-      </w:r>
-      <w:proofErr w:type="spellEnd"/>
-      <w:r>
-        <w:t>(</w:t>
-      </w:r>
-      <w:proofErr w:type="gramEnd"/>
-      <w:r>
-        <w:t>)</w:t>
+      <w:r>
+        <w:t>register(), login(), logout(), updateProfile(), viewProfile(), addToCart(), manageWishlist(), viewOrderHistory()</w:t>
       </w:r>
     </w:p>
     <w:p>
@@ -33580,23 +33119,13 @@
           <w:szCs w:val="24"/>
         </w:rPr>
       </w:pPr>
-      <w:proofErr w:type="spellStart"/>
       <w:r>
         <w:rPr>
           <w:rFonts w:ascii="Times New Roman" w:eastAsia="Times New Roman" w:hAnsi="Times New Roman" w:cs="Times New Roman"/>
           <w:sz w:val="24"/>
           <w:szCs w:val="24"/>
         </w:rPr>
-        <w:t>product_id</w:t>
-      </w:r>
-      <w:proofErr w:type="spellEnd"/>
-      <w:r>
-        <w:rPr>
-          <w:rFonts w:ascii="Times New Roman" w:eastAsia="Times New Roman" w:hAnsi="Times New Roman" w:cs="Times New Roman"/>
-          <w:sz w:val="24"/>
-          <w:szCs w:val="24"/>
-        </w:rPr>
-        <w:t>, name, brand, category, size, price, images, stock</w:t>
+        <w:t>product_id, name, brand, category, size, price, images, stock</w:t>
       </w:r>
     </w:p>
     <w:p>
@@ -33633,115 +33162,11 @@
           <w:szCs w:val="24"/>
         </w:rPr>
       </w:pPr>
-      <w:proofErr w:type="spellStart"/>
-      <w:proofErr w:type="gramStart"/>
-      <w:r>
-        <w:rPr>
-          <w:szCs w:val="24"/>
-        </w:rPr>
-        <w:t>addProduct</w:t>
-      </w:r>
-      <w:proofErr w:type="spellEnd"/>
-      <w:r>
-        <w:rPr>
-          <w:szCs w:val="24"/>
-        </w:rPr>
-        <w:t>(</w:t>
-      </w:r>
-      <w:proofErr w:type="gramEnd"/>
-      <w:r>
-        <w:rPr>
-          <w:szCs w:val="24"/>
-        </w:rPr>
-        <w:t xml:space="preserve">), </w:t>
-      </w:r>
-      <w:proofErr w:type="spellStart"/>
-      <w:proofErr w:type="gramStart"/>
-      <w:r>
-        <w:rPr>
-          <w:szCs w:val="24"/>
-        </w:rPr>
-        <w:t>updateProduct</w:t>
-      </w:r>
-      <w:proofErr w:type="spellEnd"/>
-      <w:r>
-        <w:rPr>
-          <w:szCs w:val="24"/>
-        </w:rPr>
-        <w:t>(</w:t>
-      </w:r>
-      <w:proofErr w:type="gramEnd"/>
-      <w:r>
-        <w:rPr>
-          <w:szCs w:val="24"/>
-        </w:rPr>
-        <w:t xml:space="preserve">), </w:t>
-      </w:r>
-      <w:proofErr w:type="spellStart"/>
-      <w:proofErr w:type="gramStart"/>
-      <w:r>
-        <w:rPr>
-          <w:szCs w:val="24"/>
-        </w:rPr>
-        <w:t>deleteProduct</w:t>
-      </w:r>
-      <w:proofErr w:type="spellEnd"/>
-      <w:r>
-        <w:rPr>
-          <w:szCs w:val="24"/>
-        </w:rPr>
-        <w:t>(</w:t>
-      </w:r>
-      <w:proofErr w:type="gramEnd"/>
-      <w:r>
-        <w:rPr>
-          <w:szCs w:val="24"/>
-        </w:rPr>
-        <w:t xml:space="preserve">), </w:t>
-      </w:r>
-      <w:proofErr w:type="spellStart"/>
-      <w:proofErr w:type="gramStart"/>
-      <w:r>
-        <w:rPr>
-          <w:szCs w:val="24"/>
-        </w:rPr>
-        <w:t>filterProducts</w:t>
-      </w:r>
-      <w:proofErr w:type="spellEnd"/>
-      <w:r>
-        <w:rPr>
-          <w:szCs w:val="24"/>
-        </w:rPr>
-        <w:t>(</w:t>
-      </w:r>
-      <w:proofErr w:type="gramEnd"/>
-      <w:r>
-        <w:rPr>
-          <w:szCs w:val="24"/>
-        </w:rPr>
-        <w:t xml:space="preserve">), </w:t>
-      </w:r>
-      <w:proofErr w:type="spellStart"/>
-      <w:proofErr w:type="gramStart"/>
-      <w:r>
-        <w:rPr>
-          <w:szCs w:val="24"/>
-        </w:rPr>
-        <w:t>updateInventory</w:t>
-      </w:r>
-      <w:proofErr w:type="spellEnd"/>
-      <w:r>
-        <w:rPr>
-          <w:szCs w:val="24"/>
-        </w:rPr>
-        <w:t>(</w:t>
-      </w:r>
-      <w:proofErr w:type="gramEnd"/>
-      <w:r>
-        <w:rPr>
-          <w:szCs w:val="24"/>
-        </w:rPr>
-        <w:t>)</w:t>
+      <w:r>
+        <w:rPr>
+          <w:szCs w:val="24"/>
+        </w:rPr>
+        <w:t>addProduct(), updateProduct(), deleteProduct(), filterProducts(), updateInventory()</w:t>
       </w:r>
     </w:p>
     <w:p>
@@ -33977,13 +33402,8 @@
           <w:numId w:val="39"/>
         </w:numPr>
       </w:pPr>
-      <w:proofErr w:type="spellStart"/>
-      <w:r>
-        <w:t>admin_id</w:t>
-      </w:r>
-      <w:proofErr w:type="spellEnd"/>
-      <w:r>
-        <w:t>, name, email, password</w:t>
+      <w:r>
+        <w:t>admin_id, name, email, password</w:t>
       </w:r>
     </w:p>
     <w:p>
@@ -34015,138 +33435,8 @@
           <w:numId w:val="91"/>
         </w:numPr>
       </w:pPr>
-      <w:proofErr w:type="gramStart"/>
-      <w:r>
-        <w:t>login(</w:t>
-      </w:r>
-      <w:proofErr w:type="gramEnd"/>
-      <w:r>
-        <w:t xml:space="preserve">), </w:t>
-      </w:r>
-      <w:proofErr w:type="gramStart"/>
-      <w:r>
-        <w:t>logout(</w:t>
-      </w:r>
-      <w:proofErr w:type="gramEnd"/>
-      <w:r>
-        <w:t xml:space="preserve">), </w:t>
-      </w:r>
-      <w:proofErr w:type="spellStart"/>
-      <w:proofErr w:type="gramStart"/>
-      <w:r>
-        <w:t>addProduct</w:t>
-      </w:r>
-      <w:proofErr w:type="spellEnd"/>
-      <w:r>
-        <w:t>(</w:t>
-      </w:r>
-      <w:proofErr w:type="gramEnd"/>
-      <w:r>
-        <w:t xml:space="preserve">), </w:t>
-      </w:r>
-      <w:proofErr w:type="spellStart"/>
-      <w:proofErr w:type="gramStart"/>
-      <w:r>
-        <w:t>updateProduct</w:t>
-      </w:r>
-      <w:proofErr w:type="spellEnd"/>
-      <w:r>
-        <w:t>(</w:t>
-      </w:r>
-      <w:proofErr w:type="gramEnd"/>
-      <w:r>
-        <w:t xml:space="preserve">), </w:t>
-      </w:r>
-      <w:proofErr w:type="spellStart"/>
-      <w:proofErr w:type="gramStart"/>
-      <w:r>
-        <w:t>deleteProduct</w:t>
-      </w:r>
-      <w:proofErr w:type="spellEnd"/>
-      <w:r>
-        <w:t>(</w:t>
-      </w:r>
-      <w:proofErr w:type="gramEnd"/>
-      <w:r>
-        <w:t xml:space="preserve">), </w:t>
-      </w:r>
-      <w:proofErr w:type="spellStart"/>
-      <w:proofErr w:type="gramStart"/>
-      <w:r>
-        <w:t>updateInventory</w:t>
-      </w:r>
-      <w:proofErr w:type="spellEnd"/>
-      <w:r>
-        <w:t>(</w:t>
-      </w:r>
-      <w:proofErr w:type="gramEnd"/>
-      <w:r>
-        <w:t xml:space="preserve">), </w:t>
-      </w:r>
-      <w:proofErr w:type="spellStart"/>
-      <w:proofErr w:type="gramStart"/>
-      <w:r>
-        <w:t>addCategory</w:t>
-      </w:r>
-      <w:proofErr w:type="spellEnd"/>
-      <w:r>
-        <w:t>(</w:t>
-      </w:r>
-      <w:proofErr w:type="gramEnd"/>
-      <w:r>
-        <w:t xml:space="preserve">), </w:t>
-      </w:r>
-      <w:proofErr w:type="spellStart"/>
-      <w:proofErr w:type="gramStart"/>
-      <w:r>
-        <w:t>updateCategory</w:t>
-      </w:r>
-      <w:proofErr w:type="spellEnd"/>
-      <w:r>
-        <w:t>(</w:t>
-      </w:r>
-      <w:proofErr w:type="gramEnd"/>
-      <w:r>
-        <w:t xml:space="preserve">), </w:t>
-      </w:r>
-      <w:proofErr w:type="spellStart"/>
-      <w:proofErr w:type="gramStart"/>
-      <w:r>
-        <w:t>deleteCategory</w:t>
-      </w:r>
-      <w:proofErr w:type="spellEnd"/>
-      <w:r>
-        <w:t>(</w:t>
-      </w:r>
-      <w:proofErr w:type="gramEnd"/>
-      <w:r>
-        <w:t xml:space="preserve">), </w:t>
-      </w:r>
-      <w:proofErr w:type="spellStart"/>
-      <w:proofErr w:type="gramStart"/>
-      <w:r>
-        <w:t>manageUsers</w:t>
-      </w:r>
-      <w:proofErr w:type="spellEnd"/>
-      <w:r>
-        <w:t>(</w:t>
-      </w:r>
-      <w:proofErr w:type="gramEnd"/>
-      <w:r>
-        <w:t xml:space="preserve">), </w:t>
-      </w:r>
-      <w:proofErr w:type="spellStart"/>
-      <w:proofErr w:type="gramStart"/>
-      <w:r>
-        <w:t>viewReports</w:t>
-      </w:r>
-      <w:proofErr w:type="spellEnd"/>
-      <w:r>
-        <w:t>(</w:t>
-      </w:r>
-      <w:proofErr w:type="gramEnd"/>
-      <w:r>
-        <w:t>)</w:t>
+      <w:r>
+        <w:t>login(), logout(), addProduct(), updateProduct(), deleteProduct(), updateInventory(), addCategory(), updateCategory(), deleteCategory(), manageUsers(), viewReports()</w:t>
       </w:r>
     </w:p>
     <w:p>
@@ -34354,13 +33644,8 @@
           <w:numId w:val="39"/>
         </w:numPr>
       </w:pPr>
-      <w:proofErr w:type="spellStart"/>
-      <w:r>
-        <w:t>category_id</w:t>
-      </w:r>
-      <w:proofErr w:type="spellEnd"/>
-      <w:r>
-        <w:t>, name, description</w:t>
+      <w:r>
+        <w:t>category_id, name, description</w:t>
       </w:r>
     </w:p>
     <w:p>
@@ -34392,44 +33677,8 @@
           <w:numId w:val="91"/>
         </w:numPr>
       </w:pPr>
-      <w:proofErr w:type="spellStart"/>
-      <w:proofErr w:type="gramStart"/>
-      <w:r>
-        <w:t>addCategory</w:t>
-      </w:r>
-      <w:proofErr w:type="spellEnd"/>
-      <w:r>
-        <w:t>(</w:t>
-      </w:r>
-      <w:proofErr w:type="gramEnd"/>
-      <w:r>
-        <w:t xml:space="preserve">), </w:t>
-      </w:r>
-      <w:proofErr w:type="spellStart"/>
-      <w:proofErr w:type="gramStart"/>
-      <w:r>
-        <w:t>updateCategory</w:t>
-      </w:r>
-      <w:proofErr w:type="spellEnd"/>
-      <w:r>
-        <w:t>(</w:t>
-      </w:r>
-      <w:proofErr w:type="gramEnd"/>
-      <w:r>
-        <w:t xml:space="preserve">), </w:t>
-      </w:r>
-      <w:proofErr w:type="spellStart"/>
-      <w:proofErr w:type="gramStart"/>
-      <w:r>
-        <w:t>removeCategory</w:t>
-      </w:r>
-      <w:proofErr w:type="spellEnd"/>
-      <w:r>
-        <w:t>(</w:t>
-      </w:r>
-      <w:proofErr w:type="gramEnd"/>
-      <w:r>
-        <w:t>)</w:t>
+      <w:r>
+        <w:t>addCategory(), updateCategory(), removeCategory()</w:t>
       </w:r>
     </w:p>
     <w:p>
@@ -34629,13 +33878,8 @@
           <w:numId w:val="39"/>
         </w:numPr>
       </w:pPr>
-      <w:proofErr w:type="spellStart"/>
-      <w:r>
-        <w:t>cart_id</w:t>
-      </w:r>
-      <w:proofErr w:type="spellEnd"/>
-      <w:r>
-        <w:t>, user, items</w:t>
+      <w:r>
+        <w:t>cart_id, user, items</w:t>
       </w:r>
     </w:p>
     <w:p>
@@ -34668,70 +33912,8 @@
           <w:numId w:val="91"/>
         </w:numPr>
       </w:pPr>
-      <w:proofErr w:type="spellStart"/>
-      <w:proofErr w:type="gramStart"/>
-      <w:r>
-        <w:t>addItem</w:t>
-      </w:r>
-      <w:proofErr w:type="spellEnd"/>
-      <w:r>
-        <w:t>(</w:t>
-      </w:r>
-      <w:proofErr w:type="gramEnd"/>
-      <w:r>
-        <w:t xml:space="preserve">), </w:t>
-      </w:r>
-      <w:proofErr w:type="spellStart"/>
-      <w:proofErr w:type="gramStart"/>
-      <w:r>
-        <w:t>removeItem</w:t>
-      </w:r>
-      <w:proofErr w:type="spellEnd"/>
-      <w:r>
-        <w:t>(</w:t>
-      </w:r>
-      <w:proofErr w:type="gramEnd"/>
-      <w:r>
-        <w:t xml:space="preserve">), </w:t>
-      </w:r>
-      <w:proofErr w:type="spellStart"/>
-      <w:proofErr w:type="gramStart"/>
-      <w:r>
-        <w:t>updateQuantity</w:t>
-      </w:r>
-      <w:proofErr w:type="spellEnd"/>
-      <w:r>
-        <w:t>(</w:t>
-      </w:r>
-      <w:proofErr w:type="gramEnd"/>
-      <w:r>
-        <w:t xml:space="preserve">), </w:t>
-      </w:r>
-      <w:proofErr w:type="spellStart"/>
-      <w:proofErr w:type="gramStart"/>
-      <w:r>
-        <w:t>viewCart</w:t>
-      </w:r>
-      <w:proofErr w:type="spellEnd"/>
-      <w:r>
-        <w:t>(</w:t>
-      </w:r>
-      <w:proofErr w:type="gramEnd"/>
-      <w:r>
-        <w:t xml:space="preserve">), </w:t>
-      </w:r>
-      <w:proofErr w:type="spellStart"/>
-      <w:proofErr w:type="gramStart"/>
-      <w:r>
-        <w:t>calculateTotal</w:t>
-      </w:r>
-      <w:proofErr w:type="spellEnd"/>
-      <w:r>
-        <w:t>(</w:t>
-      </w:r>
-      <w:proofErr w:type="gramEnd"/>
-      <w:r>
-        <w:t>)</w:t>
+      <w:r>
+        <w:t>addItem(), removeItem(), updateQuantity(), viewCart(), calculateTotal()</w:t>
       </w:r>
     </w:p>
     <w:p>
@@ -34861,7 +34043,6 @@
         </w:rPr>
         <w:t xml:space="preserve"> </w:t>
       </w:r>
-      <w:proofErr w:type="spellStart"/>
       <w:r>
         <w:rPr>
           <w:rFonts w:asciiTheme="minorBidi" w:eastAsia="Times New Roman" w:hAnsiTheme="minorBidi"/>
@@ -34872,7 +34053,6 @@
         </w:rPr>
         <w:t>CartItem</w:t>
       </w:r>
-      <w:proofErr w:type="spellEnd"/>
       <w:r>
         <w:rPr>
           <w:rFonts w:asciiTheme="minorBidi" w:eastAsia="Times New Roman" w:hAnsiTheme="minorBidi"/>
@@ -34956,18 +34136,8 @@
           <w:numId w:val="91"/>
         </w:numPr>
       </w:pPr>
-      <w:proofErr w:type="spellStart"/>
-      <w:proofErr w:type="gramStart"/>
-      <w:r>
-        <w:t>updateQuantity</w:t>
-      </w:r>
-      <w:proofErr w:type="spellEnd"/>
-      <w:r>
-        <w:t>(</w:t>
-      </w:r>
-      <w:proofErr w:type="gramEnd"/>
-      <w:r>
-        <w:t>)</w:t>
+      <w:r>
+        <w:t>updateQuantity()</w:t>
       </w:r>
     </w:p>
     <w:p>
@@ -35052,15 +34222,7 @@
         </w:r>
       </w:fldSimple>
       <w:r>
-        <w:t xml:space="preserve"> </w:t>
-      </w:r>
-      <w:proofErr w:type="spellStart"/>
-      <w:r>
-        <w:t>CartItem</w:t>
-      </w:r>
-      <w:proofErr w:type="spellEnd"/>
-      <w:r>
-        <w:t xml:space="preserve"> Class Diagram</w:t>
+        <w:t xml:space="preserve"> CartItem Class Diagram</w:t>
       </w:r>
     </w:p>
     <w:p>
@@ -35165,13 +34327,8 @@
           <w:numId w:val="39"/>
         </w:numPr>
       </w:pPr>
-      <w:proofErr w:type="spellStart"/>
-      <w:r>
-        <w:t>wishlist_id</w:t>
-      </w:r>
-      <w:proofErr w:type="spellEnd"/>
-      <w:r>
-        <w:t>, user, products</w:t>
+      <w:r>
+        <w:t>wishlist_id, user, products</w:t>
       </w:r>
     </w:p>
     <w:p>
@@ -35203,44 +34360,8 @@
           <w:numId w:val="91"/>
         </w:numPr>
       </w:pPr>
-      <w:proofErr w:type="spellStart"/>
-      <w:proofErr w:type="gramStart"/>
-      <w:r>
-        <w:t>addProduct</w:t>
-      </w:r>
-      <w:proofErr w:type="spellEnd"/>
-      <w:r>
-        <w:t>(</w:t>
-      </w:r>
-      <w:proofErr w:type="gramEnd"/>
-      <w:r>
-        <w:t xml:space="preserve">), </w:t>
-      </w:r>
-      <w:proofErr w:type="spellStart"/>
-      <w:proofErr w:type="gramStart"/>
-      <w:r>
-        <w:t>removeProduct</w:t>
-      </w:r>
-      <w:proofErr w:type="spellEnd"/>
-      <w:r>
-        <w:t>(</w:t>
-      </w:r>
-      <w:proofErr w:type="gramEnd"/>
-      <w:r>
-        <w:t xml:space="preserve">), </w:t>
-      </w:r>
-      <w:proofErr w:type="spellStart"/>
-      <w:proofErr w:type="gramStart"/>
-      <w:r>
-        <w:t>viewWishlist</w:t>
-      </w:r>
-      <w:proofErr w:type="spellEnd"/>
-      <w:r>
-        <w:t>(</w:t>
-      </w:r>
-      <w:proofErr w:type="gramEnd"/>
-      <w:r>
-        <w:t>)</w:t>
+      <w:r>
+        <w:t>addProduct(), removeProduct(), viewWishlist()</w:t>
       </w:r>
     </w:p>
     <w:p>
@@ -35431,35 +34552,9 @@
           <w:numId w:val="39"/>
         </w:numPr>
       </w:pPr>
-      <w:proofErr w:type="spellStart"/>
-      <w:r>
-        <w:t>order_id</w:t>
-      </w:r>
-      <w:proofErr w:type="spellEnd"/>
-      <w:r>
-        <w:t xml:space="preserve">, user, items, </w:t>
-      </w:r>
-      <w:proofErr w:type="spellStart"/>
-      <w:r>
-        <w:t>total_amount</w:t>
-      </w:r>
-      <w:proofErr w:type="spellEnd"/>
-      <w:r>
-        <w:t xml:space="preserve">, status, </w:t>
-      </w:r>
-      <w:proofErr w:type="spellStart"/>
-      <w:r>
-        <w:t>shipping_address</w:t>
-      </w:r>
-      <w:proofErr w:type="spellEnd"/>
-      <w:r>
-        <w:t xml:space="preserve">, payment, </w:t>
-      </w:r>
-      <w:proofErr w:type="spellStart"/>
-      <w:r>
-        <w:t>order_date</w:t>
-      </w:r>
-      <w:proofErr w:type="spellEnd"/>
+      <w:r>
+        <w:t>order_id, user, items, total_amount, status, shipping_address, payment, order_date</w:t>
+      </w:r>
     </w:p>
     <w:p>
       <w:pPr>
@@ -35490,57 +34585,8 @@
           <w:numId w:val="91"/>
         </w:numPr>
       </w:pPr>
-      <w:proofErr w:type="spellStart"/>
-      <w:proofErr w:type="gramStart"/>
-      <w:r>
-        <w:t>placeOrder</w:t>
-      </w:r>
-      <w:proofErr w:type="spellEnd"/>
-      <w:r>
-        <w:t>(</w:t>
-      </w:r>
-      <w:proofErr w:type="gramEnd"/>
-      <w:r>
-        <w:t xml:space="preserve">), </w:t>
-      </w:r>
-      <w:proofErr w:type="spellStart"/>
-      <w:proofErr w:type="gramStart"/>
-      <w:r>
-        <w:t>cancelOrder</w:t>
-      </w:r>
-      <w:proofErr w:type="spellEnd"/>
-      <w:r>
-        <w:t>(</w:t>
-      </w:r>
-      <w:proofErr w:type="gramEnd"/>
-      <w:r>
-        <w:t xml:space="preserve">), </w:t>
-      </w:r>
-      <w:proofErr w:type="spellStart"/>
-      <w:proofErr w:type="gramStart"/>
-      <w:r>
-        <w:t>updateStatus</w:t>
-      </w:r>
-      <w:proofErr w:type="spellEnd"/>
-      <w:r>
-        <w:t>(</w:t>
-      </w:r>
-      <w:proofErr w:type="gramEnd"/>
-      <w:r>
-        <w:t xml:space="preserve">), </w:t>
-      </w:r>
-      <w:proofErr w:type="spellStart"/>
-      <w:proofErr w:type="gramStart"/>
-      <w:r>
-        <w:t>trackOrder</w:t>
-      </w:r>
-      <w:proofErr w:type="spellEnd"/>
-      <w:r>
-        <w:t>(</w:t>
-      </w:r>
-      <w:proofErr w:type="gramEnd"/>
-      <w:r>
-        <w:t>)</w:t>
+      <w:r>
+        <w:t>placeOrder(), cancelOrder(), updateStatus(), trackOrder()</w:t>
       </w:r>
     </w:p>
     <w:p>
@@ -35670,7 +34716,6 @@
         </w:rPr>
         <w:t xml:space="preserve"> </w:t>
       </w:r>
-      <w:proofErr w:type="spellStart"/>
       <w:r>
         <w:rPr>
           <w:rFonts w:asciiTheme="minorBidi" w:eastAsia="Times New Roman" w:hAnsiTheme="minorBidi"/>
@@ -35681,7 +34726,6 @@
         </w:rPr>
         <w:t>OrderItem</w:t>
       </w:r>
-      <w:proofErr w:type="spellEnd"/>
       <w:r>
         <w:rPr>
           <w:rFonts w:asciiTheme="minorBidi" w:eastAsia="Times New Roman" w:hAnsiTheme="minorBidi"/>
@@ -35765,14 +34809,9 @@
           <w:numId w:val="91"/>
         </w:numPr>
       </w:pPr>
-      <w:proofErr w:type="spellStart"/>
       <w:r>
         <w:lastRenderedPageBreak/>
-        <w:t>calculateItemTotal</w:t>
-      </w:r>
-      <w:proofErr w:type="spellEnd"/>
-      <w:r>
-        <w:t xml:space="preserve"> </w:t>
+        <w:t xml:space="preserve">calculateItemTotal </w:t>
       </w:r>
       <w:r>
         <w:t>()</w:t>
@@ -35860,15 +34899,7 @@
         </w:r>
       </w:fldSimple>
       <w:r>
-        <w:t xml:space="preserve"> </w:t>
-      </w:r>
-      <w:proofErr w:type="spellStart"/>
-      <w:r>
-        <w:t>OrderItem</w:t>
-      </w:r>
-      <w:proofErr w:type="spellEnd"/>
-      <w:r>
-        <w:t xml:space="preserve"> Class Item</w:t>
+        <w:t xml:space="preserve"> OrderItem Class Item</w:t>
       </w:r>
     </w:p>
     <w:p>
@@ -35973,35 +35004,9 @@
           <w:numId w:val="39"/>
         </w:numPr>
       </w:pPr>
-      <w:proofErr w:type="spellStart"/>
-      <w:r>
-        <w:t>payment_id</w:t>
-      </w:r>
-      <w:proofErr w:type="spellEnd"/>
-      <w:r>
-        <w:t xml:space="preserve">, order, amount, </w:t>
-      </w:r>
-      <w:proofErr w:type="spellStart"/>
-      <w:r>
-        <w:t>payment_method</w:t>
-      </w:r>
-      <w:proofErr w:type="spellEnd"/>
-      <w:r>
-        <w:t xml:space="preserve">, </w:t>
-      </w:r>
-      <w:proofErr w:type="spellStart"/>
-      <w:r>
-        <w:t>payment_status</w:t>
-      </w:r>
-      <w:proofErr w:type="spellEnd"/>
-      <w:r>
-        <w:t xml:space="preserve">, </w:t>
-      </w:r>
-      <w:proofErr w:type="spellStart"/>
-      <w:r>
-        <w:t>payment_date</w:t>
-      </w:r>
-      <w:proofErr w:type="spellEnd"/>
+      <w:r>
+        <w:t>payment_id, order, amount, payment_method, payment_status, payment_date</w:t>
+      </w:r>
     </w:p>
     <w:p>
       <w:pPr>
@@ -36032,31 +35037,8 @@
           <w:numId w:val="91"/>
         </w:numPr>
       </w:pPr>
-      <w:proofErr w:type="spellStart"/>
-      <w:proofErr w:type="gramStart"/>
-      <w:r>
-        <w:t>processPayment</w:t>
-      </w:r>
-      <w:proofErr w:type="spellEnd"/>
-      <w:r>
-        <w:t>(</w:t>
-      </w:r>
-      <w:proofErr w:type="gramEnd"/>
-      <w:r>
-        <w:t xml:space="preserve">), </w:t>
-      </w:r>
-      <w:proofErr w:type="spellStart"/>
-      <w:proofErr w:type="gramStart"/>
-      <w:r>
-        <w:t>verifyPayment</w:t>
-      </w:r>
-      <w:proofErr w:type="spellEnd"/>
-      <w:r>
-        <w:t>(</w:t>
-      </w:r>
-      <w:proofErr w:type="gramEnd"/>
-      <w:r>
-        <w:t>)</w:t>
+      <w:r>
+        <w:t>processPayment(), verifyPayment()</w:t>
       </w:r>
     </w:p>
     <w:p>
@@ -36246,35 +35228,9 @@
           <w:numId w:val="39"/>
         </w:numPr>
       </w:pPr>
-      <w:proofErr w:type="spellStart"/>
-      <w:r>
-        <w:t>coupon_id</w:t>
-      </w:r>
-      <w:proofErr w:type="spellEnd"/>
-      <w:r>
-        <w:t xml:space="preserve">, code, </w:t>
-      </w:r>
-      <w:proofErr w:type="spellStart"/>
-      <w:r>
-        <w:t>discount_percentage</w:t>
-      </w:r>
-      <w:proofErr w:type="spellEnd"/>
-      <w:r>
-        <w:t xml:space="preserve">, </w:t>
-      </w:r>
-      <w:proofErr w:type="spellStart"/>
-      <w:r>
-        <w:t>expiry_date</w:t>
-      </w:r>
-      <w:proofErr w:type="spellEnd"/>
-      <w:r>
-        <w:t xml:space="preserve">, </w:t>
-      </w:r>
-      <w:proofErr w:type="spellStart"/>
-      <w:r>
-        <w:t>usage_limit</w:t>
-      </w:r>
-      <w:proofErr w:type="spellEnd"/>
+      <w:r>
+        <w:t>coupon_id, code, discount_percentage, expiry_date, usage_limit</w:t>
+      </w:r>
     </w:p>
     <w:p>
       <w:pPr>
@@ -36305,31 +35261,8 @@
           <w:numId w:val="91"/>
         </w:numPr>
       </w:pPr>
-      <w:proofErr w:type="spellStart"/>
-      <w:proofErr w:type="gramStart"/>
-      <w:r>
-        <w:t>applyCoupon</w:t>
-      </w:r>
-      <w:proofErr w:type="spellEnd"/>
-      <w:r>
-        <w:t>(</w:t>
-      </w:r>
-      <w:proofErr w:type="gramEnd"/>
-      <w:r>
-        <w:t xml:space="preserve">), </w:t>
-      </w:r>
-      <w:proofErr w:type="spellStart"/>
-      <w:proofErr w:type="gramStart"/>
-      <w:r>
-        <w:t>validateCoupon</w:t>
-      </w:r>
-      <w:proofErr w:type="spellEnd"/>
-      <w:r>
-        <w:t>(</w:t>
-      </w:r>
-      <w:proofErr w:type="gramEnd"/>
-      <w:r>
-        <w:t>)</w:t>
+      <w:r>
+        <w:t>applyCoupon(), validateCoupon()</w:t>
       </w:r>
     </w:p>
     <w:p>
@@ -36425,25 +35358,265 @@
     </w:p>
     <w:p>
       <w:pPr>
-        <w:rPr>
-          <w:rFonts w:asciiTheme="minorBidi" w:eastAsia="Times New Roman" w:hAnsiTheme="minorBidi"/>
-          <w:b/>
-          <w:bCs/>
-          <w:sz w:val="24"/>
-          <w:szCs w:val="24"/>
-        </w:rPr>
-      </w:pPr>
-    </w:p>
-    <w:p>
-      <w:pPr>
         <w:spacing w:before="100" w:beforeAutospacing="1" w:after="100" w:afterAutospacing="1" w:line="240" w:lineRule="auto"/>
         <w:outlineLvl w:val="3"/>
         <w:rPr>
+          <w:rFonts w:asciiTheme="minorBidi" w:eastAsia="Times New Roman" w:hAnsiTheme="minorBidi"/>
+          <w:b/>
+          <w:bCs/>
+          <w:sz w:val="24"/>
+          <w:szCs w:val="24"/>
+        </w:rPr>
+      </w:pPr>
+      <w:r>
+        <w:rPr>
+          <w:rFonts w:asciiTheme="minorBidi" w:eastAsia="Times New Roman" w:hAnsiTheme="minorBidi"/>
+          <w:b/>
+          <w:bCs/>
+          <w:sz w:val="24"/>
+          <w:szCs w:val="24"/>
+        </w:rPr>
+        <w:t>3.4.</w:t>
+      </w:r>
+      <w:r>
+        <w:rPr>
+          <w:rFonts w:asciiTheme="minorBidi" w:eastAsia="Times New Roman" w:hAnsiTheme="minorBidi"/>
+          <w:b/>
+          <w:bCs/>
+          <w:sz w:val="24"/>
+          <w:szCs w:val="24"/>
+        </w:rPr>
+        <w:t>1</w:t>
+      </w:r>
+      <w:r>
+        <w:rPr>
+          <w:rFonts w:asciiTheme="minorBidi" w:eastAsia="Times New Roman" w:hAnsiTheme="minorBidi"/>
+          <w:b/>
+          <w:bCs/>
+          <w:sz w:val="24"/>
+          <w:szCs w:val="24"/>
+        </w:rPr>
+        <w:t>2</w:t>
+      </w:r>
+      <w:r>
+        <w:rPr>
+          <w:rFonts w:asciiTheme="minorBidi" w:eastAsia="Times New Roman" w:hAnsiTheme="minorBidi"/>
+          <w:b/>
+          <w:bCs/>
+          <w:sz w:val="24"/>
+          <w:szCs w:val="24"/>
+        </w:rPr>
+        <w:t xml:space="preserve"> </w:t>
+      </w:r>
+      <w:r>
+        <w:rPr>
+          <w:rFonts w:asciiTheme="minorBidi" w:eastAsia="Times New Roman" w:hAnsiTheme="minorBidi"/>
+          <w:b/>
+          <w:bCs/>
+          <w:sz w:val="24"/>
+          <w:szCs w:val="24"/>
+        </w:rPr>
+        <w:t>Database</w:t>
+      </w:r>
+      <w:r>
+        <w:rPr>
+          <w:rFonts w:asciiTheme="minorBidi" w:eastAsia="Times New Roman" w:hAnsiTheme="minorBidi"/>
+          <w:b/>
+          <w:bCs/>
+          <w:sz w:val="24"/>
+          <w:szCs w:val="24"/>
+        </w:rPr>
+        <w:t xml:space="preserve"> </w:t>
+      </w:r>
+      <w:r>
+        <w:rPr>
+          <w:rFonts w:asciiTheme="minorBidi" w:eastAsia="Times New Roman" w:hAnsiTheme="minorBidi"/>
+          <w:b/>
+          <w:bCs/>
+          <w:sz w:val="24"/>
+          <w:szCs w:val="24"/>
+        </w:rPr>
+        <w:t xml:space="preserve">Connection </w:t>
+      </w:r>
+      <w:r>
+        <w:rPr>
+          <w:rFonts w:asciiTheme="minorBidi" w:eastAsia="Times New Roman" w:hAnsiTheme="minorBidi"/>
+          <w:b/>
+          <w:bCs/>
+          <w:sz w:val="24"/>
+          <w:szCs w:val="24"/>
+        </w:rPr>
+        <w:t>Class</w:t>
+      </w:r>
+    </w:p>
+    <w:p>
+      <w:pPr>
+        <w:spacing w:before="100" w:beforeAutospacing="1" w:after="100" w:afterAutospacing="1" w:line="240" w:lineRule="auto"/>
+        <w:outlineLvl w:val="3"/>
+        <w:rPr>
           <w:rFonts w:ascii="Times New Roman" w:eastAsia="Times New Roman" w:hAnsi="Times New Roman" w:cs="Times New Roman"/>
-          <w:sz w:val="24"/>
-          <w:szCs w:val="24"/>
-        </w:rPr>
-      </w:pPr>
+          <w:b/>
+          <w:bCs/>
+          <w:sz w:val="24"/>
+          <w:szCs w:val="24"/>
+        </w:rPr>
+      </w:pPr>
+      <w:r>
+        <w:rPr>
+          <w:rFonts w:asciiTheme="minorBidi" w:eastAsia="Times New Roman" w:hAnsiTheme="minorBidi"/>
+          <w:b/>
+          <w:bCs/>
+          <w:sz w:val="24"/>
+          <w:szCs w:val="24"/>
+        </w:rPr>
+        <w:t>Attributes</w:t>
+      </w:r>
+      <w:r>
+        <w:rPr>
+          <w:rFonts w:ascii="Times New Roman" w:eastAsia="Times New Roman" w:hAnsi="Times New Roman" w:cs="Times New Roman"/>
+          <w:b/>
+          <w:bCs/>
+          <w:sz w:val="24"/>
+          <w:szCs w:val="24"/>
+        </w:rPr>
+        <w:t>:</w:t>
+      </w:r>
+    </w:p>
+    <w:p>
+      <w:pPr>
+        <w:pStyle w:val="NormalWeb"/>
+        <w:numPr>
+          <w:ilvl w:val="0"/>
+          <w:numId w:val="91"/>
+        </w:numPr>
+      </w:pPr>
+      <w:r>
+        <w:t>host, port, database_name, username, password, connection</w:t>
+      </w:r>
+    </w:p>
+    <w:p>
+      <w:pPr>
+        <w:spacing w:before="100" w:beforeAutospacing="1" w:after="100" w:afterAutospacing="1" w:line="240" w:lineRule="auto"/>
+        <w:outlineLvl w:val="3"/>
+        <w:rPr>
+          <w:rFonts w:asciiTheme="minorBidi" w:eastAsia="Times New Roman" w:hAnsiTheme="minorBidi"/>
+          <w:sz w:val="24"/>
+          <w:szCs w:val="24"/>
+        </w:rPr>
+      </w:pPr>
+      <w:r>
+        <w:rPr>
+          <w:rFonts w:asciiTheme="minorBidi" w:eastAsia="Times New Roman" w:hAnsiTheme="minorBidi"/>
+          <w:b/>
+          <w:bCs/>
+          <w:sz w:val="24"/>
+          <w:szCs w:val="24"/>
+        </w:rPr>
+        <w:t>Functions:</w:t>
+      </w:r>
+    </w:p>
+    <w:p>
+      <w:pPr>
+        <w:pStyle w:val="NormalWeb"/>
+        <w:numPr>
+          <w:ilvl w:val="0"/>
+          <w:numId w:val="91"/>
+        </w:numPr>
+      </w:pPr>
+      <w:r>
+        <w:t>connect(), disconnect(), getConnection()</w:t>
+      </w:r>
+    </w:p>
+    <w:p>
+      <w:pPr>
+        <w:keepNext/>
+        <w:spacing w:before="100" w:beforeAutospacing="1" w:after="100" w:afterAutospacing="1" w:line="240" w:lineRule="auto"/>
+        <w:jc w:val="center"/>
+        <w:outlineLvl w:val="3"/>
+      </w:pPr>
+      <w:r>
+        <w:rPr>
+          <w:noProof/>
+        </w:rPr>
+        <w:drawing>
+          <wp:inline distT="0" distB="0" distL="0" distR="0" wp14:anchorId="359796C2" wp14:editId="4E90A7C3">
+            <wp:extent cx="1546860" cy="1805940"/>
+            <wp:effectExtent l="0" t="0" r="0" b="3810"/>
+            <wp:docPr id="1323535364" name="Picture 8"/>
+            <wp:cNvGraphicFramePr>
+              <a:graphicFrameLocks xmlns:a="http://schemas.openxmlformats.org/drawingml/2006/main" noChangeAspect="1"/>
+            </wp:cNvGraphicFramePr>
+            <a:graphic xmlns:a="http://schemas.openxmlformats.org/drawingml/2006/main">
+              <a:graphicData uri="http://schemas.openxmlformats.org/drawingml/2006/picture">
+                <pic:pic xmlns:pic="http://schemas.openxmlformats.org/drawingml/2006/picture">
+                  <pic:nvPicPr>
+                    <pic:cNvPr id="0" name="Picture 3"/>
+                    <pic:cNvPicPr>
+                      <a:picLocks noChangeAspect="1" noChangeArrowheads="1"/>
+                    </pic:cNvPicPr>
+                  </pic:nvPicPr>
+                  <pic:blipFill rotWithShape="1">
+                    <a:blip r:embed="rId57">
+                      <a:extLst>
+                        <a:ext uri="{28A0092B-C50C-407E-A947-70E740481C1C}">
+                          <a14:useLocalDpi xmlns:a14="http://schemas.microsoft.com/office/drawing/2010/main" val="0"/>
+                        </a:ext>
+                      </a:extLst>
+                    </a:blip>
+                    <a:srcRect l="4286" t="2161" r="23214" b="24691"/>
+                    <a:stretch>
+                      <a:fillRect/>
+                    </a:stretch>
+                  </pic:blipFill>
+                  <pic:spPr bwMode="auto">
+                    <a:xfrm>
+                      <a:off x="0" y="0"/>
+                      <a:ext cx="1546860" cy="1805940"/>
+                    </a:xfrm>
+                    <a:prstGeom prst="rect">
+                      <a:avLst/>
+                    </a:prstGeom>
+                    <a:noFill/>
+                    <a:ln>
+                      <a:noFill/>
+                    </a:ln>
+                    <a:extLst>
+                      <a:ext uri="{53640926-AAD7-44D8-BBD7-CCE9431645EC}">
+                        <a14:shadowObscured xmlns:a14="http://schemas.microsoft.com/office/drawing/2010/main"/>
+                      </a:ext>
+                    </a:extLst>
+                  </pic:spPr>
+                </pic:pic>
+              </a:graphicData>
+            </a:graphic>
+          </wp:inline>
+        </w:drawing>
+      </w:r>
+    </w:p>
+    <w:p>
+      <w:pPr>
+        <w:pStyle w:val="Caption"/>
+        <w:jc w:val="center"/>
+        <w:rPr>
+          <w:rFonts w:ascii="Times New Roman" w:eastAsia="Times New Roman" w:hAnsi="Times New Roman" w:cs="Times New Roman"/>
+          <w:sz w:val="24"/>
+          <w:szCs w:val="24"/>
+        </w:rPr>
+      </w:pPr>
+      <w:r>
+        <w:t xml:space="preserve">Figure </w:t>
+      </w:r>
+      <w:fldSimple w:instr=" SEQ Figure \* ARABIC ">
+        <w:r>
+          <w:rPr>
+            <w:noProof/>
+          </w:rPr>
+          <w:t>47</w:t>
+        </w:r>
+      </w:fldSimple>
+      <w:r>
+        <w:t xml:space="preserve"> Database Connection Class Diagram</w:t>
+      </w:r>
     </w:p>
     <w:p>
       <w:pPr>
@@ -36495,7 +35668,11 @@
         <w:ind w:firstLine="720"/>
       </w:pPr>
       <w:r>
-        <w:t>The ShoeCommerce website is designed to provide a fast and responsive user experience. Product pages should load within three seconds under normal operating conditions to ensure smooth browsing and customer satisfaction. The system is expected to handle at least 500 concurrent users without any noticeable degradation in performance. This includes simultaneous product searches, browsing, and checkout processes, ensuring that user interactions remain seamless even during peak usage periods.</w:t>
+        <w:t xml:space="preserve">The ShoeCommerce website is designed to provide a fast and responsive user experience. Product pages should load within three seconds under normal operating conditions to ensure smooth browsing and customer satisfaction. The system is expected to handle at least 500 concurrent users without any noticeable degradation in performance. This includes simultaneous </w:t>
+      </w:r>
+      <w:r>
+        <w:lastRenderedPageBreak/>
+        <w:t>product searches, browsing, and checkout processes, ensuring that user interactions remain seamless even during peak usage periods.</w:t>
       </w:r>
     </w:p>
     <w:p>
@@ -36613,7 +35790,6 @@
           <w:sz w:val="24"/>
           <w:szCs w:val="24"/>
         </w:rPr>
-        <w:lastRenderedPageBreak/>
         <w:t>3.5.4 Security</w:t>
       </w:r>
     </w:p>
@@ -36634,25 +35810,7 @@
           <w:sz w:val="24"/>
           <w:szCs w:val="24"/>
         </w:rPr>
-        <w:t xml:space="preserve">Security is a top priority for the ShoeCommerce website, particularly because sensitive user and payment information is processed. All user data shall be encrypted using AES-256 or an equivalent encryption standard. The website must operate over HTTPS with valid SSL/TLS certificates to secure data in transit. Additionally, two-factor authentication (2FA) shall be implemented for all admin logins to provide an extra layer of security. User passwords will be stored securely, hashed using </w:t>
-      </w:r>
-      <w:proofErr w:type="spellStart"/>
-      <w:r>
-        <w:rPr>
-          <w:rFonts w:ascii="Times New Roman" w:eastAsia="Times New Roman" w:hAnsi="Times New Roman" w:cs="Times New Roman"/>
-          <w:sz w:val="24"/>
-          <w:szCs w:val="24"/>
-        </w:rPr>
-        <w:t>bcrypt</w:t>
-      </w:r>
-      <w:proofErr w:type="spellEnd"/>
-      <w:r>
-        <w:rPr>
-          <w:rFonts w:ascii="Times New Roman" w:eastAsia="Times New Roman" w:hAnsi="Times New Roman" w:cs="Times New Roman"/>
-          <w:sz w:val="24"/>
-          <w:szCs w:val="24"/>
-        </w:rPr>
-        <w:t xml:space="preserve"> or a comparable algorithm, ensuring that even in the event of a breach, credentials remain protected.</w:t>
+        <w:t>Security is a top priority for the ShoeCommerce website, particularly because sensitive user and payment information is processed. All user data shall be encrypted using AES-256 or an equivalent encryption standard. The website must operate over HTTPS with valid SSL/TLS certificates to secure data in transit. Additionally, two-factor authentication (2FA) shall be implemented for all admin logins to provide an extra layer of security. User passwords will be stored securely, hashed using bcrypt or a comparable algorithm, ensuring that even in the event of a breach, credentials remain protected.</w:t>
       </w:r>
     </w:p>
     <w:p>
@@ -36740,6 +35898,7 @@
           <w:sz w:val="24"/>
           <w:szCs w:val="24"/>
         </w:rPr>
+        <w:lastRenderedPageBreak/>
         <w:t>The ShoeCommerce website must be portable across different environments and devices. It shall be compatible with all major web browsers, including Chrome, Firefox, Safari, and Edge, to ensure accessibility for a wide range of users. The application should be deployable on cloud platforms such as AWS or Google Cloud, providing flexibility in hosting and scalability. Furthermore, the front-end design must be fully responsive, adapting seamlessly to desktop computers, tablets, and mobile devices to deliver a consistent and optimized user experience across all screen sizes.</w:t>
       </w:r>
     </w:p>
@@ -36836,16 +35995,7 @@
           <w:sz w:val="24"/>
           <w:szCs w:val="24"/>
         </w:rPr>
-        <w:t xml:space="preserve">The platform is not intended to function as a marketplace for third-party sellers. Only authorized administrators are allowed to add, update, or manage products. Individual users </w:t>
-      </w:r>
-      <w:r>
-        <w:rPr>
-          <w:rFonts w:asciiTheme="majorBidi" w:eastAsia="Times New Roman" w:hAnsiTheme="majorBidi" w:cstheme="majorBidi"/>
-          <w:sz w:val="24"/>
-          <w:szCs w:val="24"/>
-        </w:rPr>
-        <w:lastRenderedPageBreak/>
-        <w:t>cannot upload products, set prices, or manage inventory. Additionally, the system does not include auction-based sales, bidding mechanisms, or dynamic price negotiation features.</w:t>
+        <w:t>The platform is not intended to function as a marketplace for third-party sellers. Only authorized administrators are allowed to add, update, or manage products. Individual users cannot upload products, set prices, or manage inventory. Additionally, the system does not include auction-based sales, bidding mechanisms, or dynamic price negotiation features.</w:t>
       </w:r>
     </w:p>
     <w:p>
@@ -36994,6 +36144,7 @@
           <w:sz w:val="28"/>
           <w:szCs w:val="28"/>
         </w:rPr>
+        <w:lastRenderedPageBreak/>
         <w:t>3.7 Logical Database Requirements</w:t>
       </w:r>
       <w:bookmarkEnd w:id="30"/>
@@ -37110,39 +36261,7 @@
           <w:rFonts w:asciiTheme="majorBidi" w:hAnsiTheme="majorBidi" w:cstheme="majorBidi"/>
           <w:szCs w:val="24"/>
         </w:rPr>
-        <w:t xml:space="preserve">Attributes: </w:t>
-      </w:r>
-      <w:proofErr w:type="spellStart"/>
-      <w:r>
-        <w:rPr>
-          <w:rFonts w:asciiTheme="majorBidi" w:hAnsiTheme="majorBidi" w:cstheme="majorBidi"/>
-          <w:szCs w:val="24"/>
-        </w:rPr>
-        <w:t>user_id</w:t>
-      </w:r>
-      <w:proofErr w:type="spellEnd"/>
-      <w:r>
-        <w:rPr>
-          <w:rFonts w:asciiTheme="majorBidi" w:hAnsiTheme="majorBidi" w:cstheme="majorBidi"/>
-          <w:szCs w:val="24"/>
-        </w:rPr>
-        <w:t xml:space="preserve">, name, email, password, phone, </w:t>
-      </w:r>
-      <w:proofErr w:type="spellStart"/>
-      <w:r>
-        <w:rPr>
-          <w:rFonts w:asciiTheme="majorBidi" w:hAnsiTheme="majorBidi" w:cstheme="majorBidi"/>
-          <w:szCs w:val="24"/>
-        </w:rPr>
-        <w:t>shipping_address</w:t>
-      </w:r>
-      <w:proofErr w:type="spellEnd"/>
-      <w:r>
-        <w:rPr>
-          <w:rFonts w:asciiTheme="majorBidi" w:hAnsiTheme="majorBidi" w:cstheme="majorBidi"/>
-          <w:szCs w:val="24"/>
-        </w:rPr>
-        <w:t>.</w:t>
+        <w:t>Attributes: user_id, name, email, password, phone, shipping_address.</w:t>
       </w:r>
     </w:p>
     <w:p>
@@ -37173,23 +36292,7 @@
           <w:rFonts w:asciiTheme="majorBidi" w:hAnsiTheme="majorBidi" w:cstheme="majorBidi"/>
           <w:szCs w:val="24"/>
         </w:rPr>
-        <w:t xml:space="preserve">: Stores admin identification and credentials. Attributes: </w:t>
-      </w:r>
-      <w:proofErr w:type="spellStart"/>
-      <w:r>
-        <w:rPr>
-          <w:rFonts w:asciiTheme="majorBidi" w:hAnsiTheme="majorBidi" w:cstheme="majorBidi"/>
-          <w:szCs w:val="24"/>
-        </w:rPr>
-        <w:t>admin_id</w:t>
-      </w:r>
-      <w:proofErr w:type="spellEnd"/>
-      <w:r>
-        <w:rPr>
-          <w:rFonts w:asciiTheme="majorBidi" w:hAnsiTheme="majorBidi" w:cstheme="majorBidi"/>
-          <w:szCs w:val="24"/>
-        </w:rPr>
-        <w:t>, name, email, password.</w:t>
+        <w:t>: Stores admin identification and credentials. Attributes: admin_id, name, email, password.</w:t>
       </w:r>
     </w:p>
     <w:p>
@@ -37220,39 +36323,7 @@
           <w:rFonts w:asciiTheme="majorBidi" w:hAnsiTheme="majorBidi" w:cstheme="majorBidi"/>
           <w:szCs w:val="24"/>
         </w:rPr>
-        <w:t xml:space="preserve">: Stores shoe product details. Attributes: </w:t>
-      </w:r>
-      <w:proofErr w:type="spellStart"/>
-      <w:r>
-        <w:rPr>
-          <w:rFonts w:asciiTheme="majorBidi" w:hAnsiTheme="majorBidi" w:cstheme="majorBidi"/>
-          <w:szCs w:val="24"/>
-        </w:rPr>
-        <w:t>product_id</w:t>
-      </w:r>
-      <w:proofErr w:type="spellEnd"/>
-      <w:r>
-        <w:rPr>
-          <w:rFonts w:asciiTheme="majorBidi" w:hAnsiTheme="majorBidi" w:cstheme="majorBidi"/>
-          <w:szCs w:val="24"/>
-        </w:rPr>
-        <w:t xml:space="preserve">, name, brand, </w:t>
-      </w:r>
-      <w:proofErr w:type="spellStart"/>
-      <w:r>
-        <w:rPr>
-          <w:rFonts w:asciiTheme="majorBidi" w:hAnsiTheme="majorBidi" w:cstheme="majorBidi"/>
-          <w:szCs w:val="24"/>
-        </w:rPr>
-        <w:t>category_id</w:t>
-      </w:r>
-      <w:proofErr w:type="spellEnd"/>
-      <w:r>
-        <w:rPr>
-          <w:rFonts w:asciiTheme="majorBidi" w:hAnsiTheme="majorBidi" w:cstheme="majorBidi"/>
-          <w:szCs w:val="24"/>
-        </w:rPr>
-        <w:t>, size, price, images, stock.</w:t>
+        <w:t>: Stores shoe product details. Attributes: product_id, name, brand, category_id, size, price, images, stock.</w:t>
       </w:r>
     </w:p>
     <w:p>
@@ -37283,23 +36354,7 @@
           <w:rFonts w:asciiTheme="majorBidi" w:hAnsiTheme="majorBidi" w:cstheme="majorBidi"/>
           <w:szCs w:val="24"/>
         </w:rPr>
-        <w:t xml:space="preserve">: Stores product categories. Attributes: </w:t>
-      </w:r>
-      <w:proofErr w:type="spellStart"/>
-      <w:r>
-        <w:rPr>
-          <w:rFonts w:asciiTheme="majorBidi" w:hAnsiTheme="majorBidi" w:cstheme="majorBidi"/>
-          <w:szCs w:val="24"/>
-        </w:rPr>
-        <w:t>category_id</w:t>
-      </w:r>
-      <w:proofErr w:type="spellEnd"/>
-      <w:r>
-        <w:rPr>
-          <w:rFonts w:asciiTheme="majorBidi" w:hAnsiTheme="majorBidi" w:cstheme="majorBidi"/>
-          <w:szCs w:val="24"/>
-        </w:rPr>
-        <w:t>, name, description.</w:t>
+        <w:t>: Stores product categories. Attributes: category_id, name, description.</w:t>
       </w:r>
     </w:p>
     <w:p>
@@ -37330,119 +36385,7 @@
           <w:rFonts w:asciiTheme="majorBidi" w:hAnsiTheme="majorBidi" w:cstheme="majorBidi"/>
           <w:szCs w:val="24"/>
         </w:rPr>
-        <w:t xml:space="preserve">: Stores order details. Attributes: </w:t>
-      </w:r>
-      <w:proofErr w:type="spellStart"/>
-      <w:r>
-        <w:rPr>
-          <w:rFonts w:asciiTheme="majorBidi" w:hAnsiTheme="majorBidi" w:cstheme="majorBidi"/>
-          <w:szCs w:val="24"/>
-        </w:rPr>
-        <w:t>order_id</w:t>
-      </w:r>
-      <w:proofErr w:type="spellEnd"/>
-      <w:r>
-        <w:rPr>
-          <w:rFonts w:asciiTheme="majorBidi" w:hAnsiTheme="majorBidi" w:cstheme="majorBidi"/>
-          <w:szCs w:val="24"/>
-        </w:rPr>
-        <w:t xml:space="preserve">, </w:t>
-      </w:r>
-      <w:proofErr w:type="spellStart"/>
-      <w:r>
-        <w:rPr>
-          <w:rFonts w:asciiTheme="majorBidi" w:hAnsiTheme="majorBidi" w:cstheme="majorBidi"/>
-          <w:szCs w:val="24"/>
-        </w:rPr>
-        <w:t>user_id</w:t>
-      </w:r>
-      <w:proofErr w:type="spellEnd"/>
-      <w:r>
-        <w:rPr>
-          <w:rFonts w:asciiTheme="majorBidi" w:hAnsiTheme="majorBidi" w:cstheme="majorBidi"/>
-          <w:szCs w:val="24"/>
-        </w:rPr>
-        <w:t xml:space="preserve">, </w:t>
-      </w:r>
-      <w:proofErr w:type="spellStart"/>
-      <w:r>
-        <w:rPr>
-          <w:rFonts w:asciiTheme="majorBidi" w:hAnsiTheme="majorBidi" w:cstheme="majorBidi"/>
-          <w:szCs w:val="24"/>
-        </w:rPr>
-        <w:t>total_amount</w:t>
-      </w:r>
-      <w:proofErr w:type="spellEnd"/>
-      <w:r>
-        <w:rPr>
-          <w:rFonts w:asciiTheme="majorBidi" w:hAnsiTheme="majorBidi" w:cstheme="majorBidi"/>
-          <w:szCs w:val="24"/>
-        </w:rPr>
-        <w:t xml:space="preserve">, status, </w:t>
-      </w:r>
-      <w:proofErr w:type="spellStart"/>
-      <w:r>
-        <w:rPr>
-          <w:rFonts w:asciiTheme="majorBidi" w:hAnsiTheme="majorBidi" w:cstheme="majorBidi"/>
-          <w:szCs w:val="24"/>
-        </w:rPr>
-        <w:t>shipping_address</w:t>
-      </w:r>
-      <w:proofErr w:type="spellEnd"/>
-      <w:r>
-        <w:rPr>
-          <w:rFonts w:asciiTheme="majorBidi" w:hAnsiTheme="majorBidi" w:cstheme="majorBidi"/>
-          <w:szCs w:val="24"/>
-        </w:rPr>
-        <w:t xml:space="preserve">, </w:t>
-      </w:r>
-      <w:proofErr w:type="spellStart"/>
-      <w:r>
-        <w:rPr>
-          <w:rFonts w:asciiTheme="majorBidi" w:hAnsiTheme="majorBidi" w:cstheme="majorBidi"/>
-          <w:szCs w:val="24"/>
-        </w:rPr>
-        <w:t>payment_id</w:t>
-      </w:r>
-      <w:proofErr w:type="spellEnd"/>
-      <w:r>
-        <w:rPr>
-          <w:rFonts w:asciiTheme="majorBidi" w:hAnsiTheme="majorBidi" w:cstheme="majorBidi"/>
-          <w:szCs w:val="24"/>
-        </w:rPr>
-        <w:t xml:space="preserve">, </w:t>
-      </w:r>
-      <w:proofErr w:type="spellStart"/>
-      <w:r>
-        <w:rPr>
-          <w:rFonts w:asciiTheme="majorBidi" w:hAnsiTheme="majorBidi" w:cstheme="majorBidi"/>
-          <w:szCs w:val="24"/>
-        </w:rPr>
-        <w:t>coupon_id</w:t>
-      </w:r>
-      <w:proofErr w:type="spellEnd"/>
-      <w:r>
-        <w:rPr>
-          <w:rFonts w:asciiTheme="majorBidi" w:hAnsiTheme="majorBidi" w:cstheme="majorBidi"/>
-          <w:szCs w:val="24"/>
-        </w:rPr>
-        <w:t xml:space="preserve">, </w:t>
-      </w:r>
-      <w:proofErr w:type="spellStart"/>
-      <w:r>
-        <w:rPr>
-          <w:rFonts w:asciiTheme="majorBidi" w:hAnsiTheme="majorBidi" w:cstheme="majorBidi"/>
-          <w:szCs w:val="24"/>
-        </w:rPr>
-        <w:t>order_date</w:t>
-      </w:r>
-      <w:proofErr w:type="spellEnd"/>
-      <w:r>
-        <w:rPr>
-          <w:rFonts w:asciiTheme="majorBidi" w:hAnsiTheme="majorBidi" w:cstheme="majorBidi"/>
-          <w:szCs w:val="24"/>
-        </w:rPr>
-        <w:t>.</w:t>
+        <w:t>: Stores order details. Attributes: order_id, user_id, total_amount, status, shipping_address, payment_id, coupon_id, order_date.</w:t>
       </w:r>
     </w:p>
     <w:p>
@@ -37473,55 +36416,7 @@
           <w:rFonts w:asciiTheme="majorBidi" w:hAnsiTheme="majorBidi" w:cstheme="majorBidi"/>
           <w:szCs w:val="24"/>
         </w:rPr>
-        <w:t xml:space="preserve">: Stores products in each order. Attributes: </w:t>
-      </w:r>
-      <w:proofErr w:type="spellStart"/>
-      <w:r>
-        <w:rPr>
-          <w:rFonts w:asciiTheme="majorBidi" w:hAnsiTheme="majorBidi" w:cstheme="majorBidi"/>
-          <w:szCs w:val="24"/>
-        </w:rPr>
-        <w:t>orderitem_id</w:t>
-      </w:r>
-      <w:proofErr w:type="spellEnd"/>
-      <w:r>
-        <w:rPr>
-          <w:rFonts w:asciiTheme="majorBidi" w:hAnsiTheme="majorBidi" w:cstheme="majorBidi"/>
-          <w:szCs w:val="24"/>
-        </w:rPr>
-        <w:t xml:space="preserve">, </w:t>
-      </w:r>
-      <w:proofErr w:type="spellStart"/>
-      <w:r>
-        <w:rPr>
-          <w:rFonts w:asciiTheme="majorBidi" w:hAnsiTheme="majorBidi" w:cstheme="majorBidi"/>
-          <w:szCs w:val="24"/>
-        </w:rPr>
-        <w:t>order_id</w:t>
-      </w:r>
-      <w:proofErr w:type="spellEnd"/>
-      <w:r>
-        <w:rPr>
-          <w:rFonts w:asciiTheme="majorBidi" w:hAnsiTheme="majorBidi" w:cstheme="majorBidi"/>
-          <w:szCs w:val="24"/>
-        </w:rPr>
-        <w:t xml:space="preserve">, </w:t>
-      </w:r>
-      <w:proofErr w:type="spellStart"/>
-      <w:r>
-        <w:rPr>
-          <w:rFonts w:asciiTheme="majorBidi" w:hAnsiTheme="majorBidi" w:cstheme="majorBidi"/>
-          <w:szCs w:val="24"/>
-        </w:rPr>
-        <w:t>product_id</w:t>
-      </w:r>
-      <w:proofErr w:type="spellEnd"/>
-      <w:r>
-        <w:rPr>
-          <w:rFonts w:asciiTheme="majorBidi" w:hAnsiTheme="majorBidi" w:cstheme="majorBidi"/>
-          <w:szCs w:val="24"/>
-        </w:rPr>
-        <w:t>, quantity, price.</w:t>
+        <w:t>: Stores products in each order. Attributes: orderitem_id, order_id, product_id, quantity, price.</w:t>
       </w:r>
     </w:p>
     <w:p>
@@ -37552,87 +36447,7 @@
           <w:rFonts w:asciiTheme="majorBidi" w:hAnsiTheme="majorBidi" w:cstheme="majorBidi"/>
           <w:szCs w:val="24"/>
         </w:rPr>
-        <w:t xml:space="preserve">: Stores payment details. Attributes: </w:t>
-      </w:r>
-      <w:proofErr w:type="spellStart"/>
-      <w:r>
-        <w:rPr>
-          <w:rFonts w:asciiTheme="majorBidi" w:hAnsiTheme="majorBidi" w:cstheme="majorBidi"/>
-          <w:szCs w:val="24"/>
-        </w:rPr>
-        <w:t>payment_id</w:t>
-      </w:r>
-      <w:proofErr w:type="spellEnd"/>
-      <w:r>
-        <w:rPr>
-          <w:rFonts w:asciiTheme="majorBidi" w:hAnsiTheme="majorBidi" w:cstheme="majorBidi"/>
-          <w:szCs w:val="24"/>
-        </w:rPr>
-        <w:t xml:space="preserve">, </w:t>
-      </w:r>
-      <w:proofErr w:type="spellStart"/>
-      <w:r>
-        <w:rPr>
-          <w:rFonts w:asciiTheme="majorBidi" w:hAnsiTheme="majorBidi" w:cstheme="majorBidi"/>
-          <w:szCs w:val="24"/>
-        </w:rPr>
-        <w:t>order_id</w:t>
-      </w:r>
-      <w:proofErr w:type="spellEnd"/>
-      <w:r>
-        <w:rPr>
-          <w:rFonts w:asciiTheme="majorBidi" w:hAnsiTheme="majorBidi" w:cstheme="majorBidi"/>
-          <w:szCs w:val="24"/>
-        </w:rPr>
-        <w:t xml:space="preserve">, amount, </w:t>
-      </w:r>
-      <w:proofErr w:type="spellStart"/>
-      <w:r>
-        <w:rPr>
-          <w:rFonts w:asciiTheme="majorBidi" w:hAnsiTheme="majorBidi" w:cstheme="majorBidi"/>
-          <w:szCs w:val="24"/>
-        </w:rPr>
-        <w:t>payment_method</w:t>
-      </w:r>
-      <w:proofErr w:type="spellEnd"/>
-      <w:r>
-        <w:rPr>
-          <w:rFonts w:asciiTheme="majorBidi" w:hAnsiTheme="majorBidi" w:cstheme="majorBidi"/>
-          <w:szCs w:val="24"/>
-        </w:rPr>
-        <w:t xml:space="preserve">, </w:t>
-      </w:r>
-      <w:proofErr w:type="spellStart"/>
-      <w:r>
-        <w:rPr>
-          <w:rFonts w:asciiTheme="majorBidi" w:hAnsiTheme="majorBidi" w:cstheme="majorBidi"/>
-          <w:szCs w:val="24"/>
-        </w:rPr>
-        <w:t>payment_status</w:t>
-      </w:r>
-      <w:proofErr w:type="spellEnd"/>
-      <w:r>
-        <w:rPr>
-          <w:rFonts w:asciiTheme="majorBidi" w:hAnsiTheme="majorBidi" w:cstheme="majorBidi"/>
-          <w:szCs w:val="24"/>
-        </w:rPr>
-        <w:t xml:space="preserve">, </w:t>
-      </w:r>
-      <w:proofErr w:type="spellStart"/>
-      <w:r>
-        <w:rPr>
-          <w:rFonts w:asciiTheme="majorBidi" w:hAnsiTheme="majorBidi" w:cstheme="majorBidi"/>
-          <w:szCs w:val="24"/>
-        </w:rPr>
-        <w:t>payment_date</w:t>
-      </w:r>
-      <w:proofErr w:type="spellEnd"/>
-      <w:r>
-        <w:rPr>
-          <w:rFonts w:asciiTheme="majorBidi" w:hAnsiTheme="majorBidi" w:cstheme="majorBidi"/>
-          <w:szCs w:val="24"/>
-        </w:rPr>
-        <w:t>.</w:t>
+        <w:t>: Stores payment details. Attributes: payment_id, order_id, amount, payment_method, payment_status, payment_date.</w:t>
       </w:r>
     </w:p>
     <w:p>
@@ -37656,7 +36471,6 @@
           <w:bCs/>
           <w:szCs w:val="24"/>
         </w:rPr>
-        <w:lastRenderedPageBreak/>
         <w:t>COUPON</w:t>
       </w:r>
       <w:r>
@@ -37664,71 +36478,7 @@
           <w:rFonts w:asciiTheme="majorBidi" w:hAnsiTheme="majorBidi" w:cstheme="majorBidi"/>
           <w:szCs w:val="24"/>
         </w:rPr>
-        <w:t xml:space="preserve">: Stores discount coupon information. Attributes: </w:t>
-      </w:r>
-      <w:proofErr w:type="spellStart"/>
-      <w:r>
-        <w:rPr>
-          <w:rFonts w:asciiTheme="majorBidi" w:hAnsiTheme="majorBidi" w:cstheme="majorBidi"/>
-          <w:szCs w:val="24"/>
-        </w:rPr>
-        <w:t>coupon_id</w:t>
-      </w:r>
-      <w:proofErr w:type="spellEnd"/>
-      <w:r>
-        <w:rPr>
-          <w:rFonts w:asciiTheme="majorBidi" w:hAnsiTheme="majorBidi" w:cstheme="majorBidi"/>
-          <w:szCs w:val="24"/>
-        </w:rPr>
-        <w:t xml:space="preserve">, code, </w:t>
-      </w:r>
-      <w:proofErr w:type="spellStart"/>
-      <w:r>
-        <w:rPr>
-          <w:rFonts w:asciiTheme="majorBidi" w:hAnsiTheme="majorBidi" w:cstheme="majorBidi"/>
-          <w:szCs w:val="24"/>
-        </w:rPr>
-        <w:t>discount_percentage</w:t>
-      </w:r>
-      <w:proofErr w:type="spellEnd"/>
-      <w:r>
-        <w:rPr>
-          <w:rFonts w:asciiTheme="majorBidi" w:hAnsiTheme="majorBidi" w:cstheme="majorBidi"/>
-          <w:szCs w:val="24"/>
-        </w:rPr>
-        <w:t xml:space="preserve">, </w:t>
-      </w:r>
-      <w:proofErr w:type="spellStart"/>
-      <w:r>
-        <w:rPr>
-          <w:rFonts w:asciiTheme="majorBidi" w:hAnsiTheme="majorBidi" w:cstheme="majorBidi"/>
-          <w:szCs w:val="24"/>
-        </w:rPr>
-        <w:t>expiry_date</w:t>
-      </w:r>
-      <w:proofErr w:type="spellEnd"/>
-      <w:r>
-        <w:rPr>
-          <w:rFonts w:asciiTheme="majorBidi" w:hAnsiTheme="majorBidi" w:cstheme="majorBidi"/>
-          <w:szCs w:val="24"/>
-        </w:rPr>
-        <w:t xml:space="preserve">, </w:t>
-      </w:r>
-      <w:proofErr w:type="spellStart"/>
-      <w:r>
-        <w:rPr>
-          <w:rFonts w:asciiTheme="majorBidi" w:hAnsiTheme="majorBidi" w:cstheme="majorBidi"/>
-          <w:szCs w:val="24"/>
-        </w:rPr>
-        <w:t>usage_limit</w:t>
-      </w:r>
-      <w:proofErr w:type="spellEnd"/>
-      <w:r>
-        <w:rPr>
-          <w:rFonts w:asciiTheme="majorBidi" w:hAnsiTheme="majorBidi" w:cstheme="majorBidi"/>
-          <w:szCs w:val="24"/>
-        </w:rPr>
-        <w:t>.</w:t>
+        <w:t>: Stores discount coupon information. Attributes: coupon_id, code, discount_percentage, expiry_date, usage_limit.</w:t>
       </w:r>
     </w:p>
     <w:p>
@@ -37759,39 +36509,7 @@
           <w:rFonts w:asciiTheme="majorBidi" w:hAnsiTheme="majorBidi" w:cstheme="majorBidi"/>
           <w:szCs w:val="24"/>
         </w:rPr>
-        <w:t xml:space="preserve">: Stores user shopping carts. Attributes: </w:t>
-      </w:r>
-      <w:proofErr w:type="spellStart"/>
-      <w:r>
-        <w:rPr>
-          <w:rFonts w:asciiTheme="majorBidi" w:hAnsiTheme="majorBidi" w:cstheme="majorBidi"/>
-          <w:szCs w:val="24"/>
-        </w:rPr>
-        <w:t>cart_id</w:t>
-      </w:r>
-      <w:proofErr w:type="spellEnd"/>
-      <w:r>
-        <w:rPr>
-          <w:rFonts w:asciiTheme="majorBidi" w:hAnsiTheme="majorBidi" w:cstheme="majorBidi"/>
-          <w:szCs w:val="24"/>
-        </w:rPr>
-        <w:t xml:space="preserve">, </w:t>
-      </w:r>
-      <w:proofErr w:type="spellStart"/>
-      <w:r>
-        <w:rPr>
-          <w:rFonts w:asciiTheme="majorBidi" w:hAnsiTheme="majorBidi" w:cstheme="majorBidi"/>
-          <w:szCs w:val="24"/>
-        </w:rPr>
-        <w:t>user_id</w:t>
-      </w:r>
-      <w:proofErr w:type="spellEnd"/>
-      <w:r>
-        <w:rPr>
-          <w:rFonts w:asciiTheme="majorBidi" w:hAnsiTheme="majorBidi" w:cstheme="majorBidi"/>
-          <w:szCs w:val="24"/>
-        </w:rPr>
-        <w:t>.</w:t>
+        <w:t>: Stores user shopping carts. Attributes: cart_id, user_id.</w:t>
       </w:r>
     </w:p>
     <w:p>
@@ -37822,55 +36540,7 @@
           <w:rFonts w:asciiTheme="majorBidi" w:hAnsiTheme="majorBidi" w:cstheme="majorBidi"/>
           <w:szCs w:val="24"/>
         </w:rPr>
-        <w:t xml:space="preserve">: Stores products in carts. Attributes: </w:t>
-      </w:r>
-      <w:proofErr w:type="spellStart"/>
-      <w:r>
-        <w:rPr>
-          <w:rFonts w:asciiTheme="majorBidi" w:hAnsiTheme="majorBidi" w:cstheme="majorBidi"/>
-          <w:szCs w:val="24"/>
-        </w:rPr>
-        <w:t>cartitem_id</w:t>
-      </w:r>
-      <w:proofErr w:type="spellEnd"/>
-      <w:r>
-        <w:rPr>
-          <w:rFonts w:asciiTheme="majorBidi" w:hAnsiTheme="majorBidi" w:cstheme="majorBidi"/>
-          <w:szCs w:val="24"/>
-        </w:rPr>
-        <w:t xml:space="preserve">, </w:t>
-      </w:r>
-      <w:proofErr w:type="spellStart"/>
-      <w:r>
-        <w:rPr>
-          <w:rFonts w:asciiTheme="majorBidi" w:hAnsiTheme="majorBidi" w:cstheme="majorBidi"/>
-          <w:szCs w:val="24"/>
-        </w:rPr>
-        <w:t>cart_id</w:t>
-      </w:r>
-      <w:proofErr w:type="spellEnd"/>
-      <w:r>
-        <w:rPr>
-          <w:rFonts w:asciiTheme="majorBidi" w:hAnsiTheme="majorBidi" w:cstheme="majorBidi"/>
-          <w:szCs w:val="24"/>
-        </w:rPr>
-        <w:t xml:space="preserve">, </w:t>
-      </w:r>
-      <w:proofErr w:type="spellStart"/>
-      <w:r>
-        <w:rPr>
-          <w:rFonts w:asciiTheme="majorBidi" w:hAnsiTheme="majorBidi" w:cstheme="majorBidi"/>
-          <w:szCs w:val="24"/>
-        </w:rPr>
-        <w:t>product_id</w:t>
-      </w:r>
-      <w:proofErr w:type="spellEnd"/>
-      <w:r>
-        <w:rPr>
-          <w:rFonts w:asciiTheme="majorBidi" w:hAnsiTheme="majorBidi" w:cstheme="majorBidi"/>
-          <w:szCs w:val="24"/>
-        </w:rPr>
-        <w:t>, quantity.</w:t>
+        <w:t>: Stores products in carts. Attributes: cartitem_id, cart_id, product_id, quantity.</w:t>
       </w:r>
     </w:p>
     <w:p>
@@ -37901,55 +36571,7 @@
           <w:rFonts w:asciiTheme="majorBidi" w:hAnsiTheme="majorBidi" w:cstheme="majorBidi"/>
           <w:szCs w:val="24"/>
         </w:rPr>
-        <w:t xml:space="preserve">: Stores user </w:t>
-      </w:r>
-      <w:proofErr w:type="spellStart"/>
-      <w:r>
-        <w:rPr>
-          <w:rFonts w:asciiTheme="majorBidi" w:hAnsiTheme="majorBidi" w:cstheme="majorBidi"/>
-          <w:szCs w:val="24"/>
-        </w:rPr>
-        <w:t>wishlists</w:t>
-      </w:r>
-      <w:proofErr w:type="spellEnd"/>
-      <w:r>
-        <w:rPr>
-          <w:rFonts w:asciiTheme="majorBidi" w:hAnsiTheme="majorBidi" w:cstheme="majorBidi"/>
-          <w:szCs w:val="24"/>
-        </w:rPr>
-        <w:t xml:space="preserve">. Attributes: </w:t>
-      </w:r>
-      <w:proofErr w:type="spellStart"/>
-      <w:r>
-        <w:rPr>
-          <w:rFonts w:asciiTheme="majorBidi" w:hAnsiTheme="majorBidi" w:cstheme="majorBidi"/>
-          <w:szCs w:val="24"/>
-        </w:rPr>
-        <w:t>wishlist_id</w:t>
-      </w:r>
-      <w:proofErr w:type="spellEnd"/>
-      <w:r>
-        <w:rPr>
-          <w:rFonts w:asciiTheme="majorBidi" w:hAnsiTheme="majorBidi" w:cstheme="majorBidi"/>
-          <w:szCs w:val="24"/>
-        </w:rPr>
-        <w:t xml:space="preserve">, </w:t>
-      </w:r>
-      <w:proofErr w:type="spellStart"/>
-      <w:r>
-        <w:rPr>
-          <w:rFonts w:asciiTheme="majorBidi" w:hAnsiTheme="majorBidi" w:cstheme="majorBidi"/>
-          <w:szCs w:val="24"/>
-        </w:rPr>
-        <w:t>user_id</w:t>
-      </w:r>
-      <w:proofErr w:type="spellEnd"/>
-      <w:r>
-        <w:rPr>
-          <w:rFonts w:asciiTheme="majorBidi" w:hAnsiTheme="majorBidi" w:cstheme="majorBidi"/>
-          <w:szCs w:val="24"/>
-        </w:rPr>
-        <w:t>.</w:t>
+        <w:t>: Stores user wishlists. Attributes: wishlist_id, user_id.</w:t>
       </w:r>
     </w:p>
     <w:p>
@@ -37980,71 +36602,7 @@
           <w:rFonts w:asciiTheme="majorBidi" w:hAnsiTheme="majorBidi" w:cstheme="majorBidi"/>
           <w:szCs w:val="24"/>
         </w:rPr>
-        <w:t xml:space="preserve">: Stores products in </w:t>
-      </w:r>
-      <w:proofErr w:type="spellStart"/>
-      <w:r>
-        <w:rPr>
-          <w:rFonts w:asciiTheme="majorBidi" w:hAnsiTheme="majorBidi" w:cstheme="majorBidi"/>
-          <w:szCs w:val="24"/>
-        </w:rPr>
-        <w:t>wishlists</w:t>
-      </w:r>
-      <w:proofErr w:type="spellEnd"/>
-      <w:r>
-        <w:rPr>
-          <w:rFonts w:asciiTheme="majorBidi" w:hAnsiTheme="majorBidi" w:cstheme="majorBidi"/>
-          <w:szCs w:val="24"/>
-        </w:rPr>
-        <w:t xml:space="preserve">. Attributes: </w:t>
-      </w:r>
-      <w:proofErr w:type="spellStart"/>
-      <w:r>
-        <w:rPr>
-          <w:rFonts w:asciiTheme="majorBidi" w:hAnsiTheme="majorBidi" w:cstheme="majorBidi"/>
-          <w:szCs w:val="24"/>
-        </w:rPr>
-        <w:t>wishlistitem_id</w:t>
-      </w:r>
-      <w:proofErr w:type="spellEnd"/>
-      <w:r>
-        <w:rPr>
-          <w:rFonts w:asciiTheme="majorBidi" w:hAnsiTheme="majorBidi" w:cstheme="majorBidi"/>
-          <w:szCs w:val="24"/>
-        </w:rPr>
-        <w:t xml:space="preserve">, </w:t>
-      </w:r>
-      <w:proofErr w:type="spellStart"/>
-      <w:r>
-        <w:rPr>
-          <w:rFonts w:asciiTheme="majorBidi" w:hAnsiTheme="majorBidi" w:cstheme="majorBidi"/>
-          <w:szCs w:val="24"/>
-        </w:rPr>
-        <w:t>wishlist_id</w:t>
-      </w:r>
-      <w:proofErr w:type="spellEnd"/>
-      <w:r>
-        <w:rPr>
-          <w:rFonts w:asciiTheme="majorBidi" w:hAnsiTheme="majorBidi" w:cstheme="majorBidi"/>
-          <w:szCs w:val="24"/>
-        </w:rPr>
-        <w:t xml:space="preserve">, </w:t>
-      </w:r>
-      <w:proofErr w:type="spellStart"/>
-      <w:r>
-        <w:rPr>
-          <w:rFonts w:asciiTheme="majorBidi" w:hAnsiTheme="majorBidi" w:cstheme="majorBidi"/>
-          <w:szCs w:val="24"/>
-        </w:rPr>
-        <w:t>product_id</w:t>
-      </w:r>
-      <w:proofErr w:type="spellEnd"/>
-      <w:r>
-        <w:rPr>
-          <w:rFonts w:asciiTheme="majorBidi" w:hAnsiTheme="majorBidi" w:cstheme="majorBidi"/>
-          <w:szCs w:val="24"/>
-        </w:rPr>
-        <w:t>.</w:t>
+        <w:t>: Stores products in wishlists. Attributes: wishlistitem_id, wishlist_id, product_id.</w:t>
       </w:r>
     </w:p>
     <w:p>
@@ -38087,25 +36645,7 @@
           <w:sz w:val="24"/>
           <w:szCs w:val="24"/>
         </w:rPr>
-        <w:t xml:space="preserve">User data is accessed frequently during login, profile updates, checkout, and order history viewing. Product and category data are among the most frequently accessed entities, as they are continuously retrieved during browsing, searching, and filtering operations. Cart and </w:t>
-      </w:r>
-      <w:proofErr w:type="spellStart"/>
-      <w:r>
-        <w:rPr>
-          <w:rFonts w:asciiTheme="majorBidi" w:eastAsia="Times New Roman" w:hAnsiTheme="majorBidi" w:cstheme="majorBidi"/>
-          <w:sz w:val="24"/>
-          <w:szCs w:val="24"/>
-        </w:rPr>
-        <w:t>wishlist</w:t>
-      </w:r>
-      <w:proofErr w:type="spellEnd"/>
-      <w:r>
-        <w:rPr>
-          <w:rFonts w:asciiTheme="majorBidi" w:eastAsia="Times New Roman" w:hAnsiTheme="majorBidi" w:cstheme="majorBidi"/>
-          <w:sz w:val="24"/>
-          <w:szCs w:val="24"/>
-        </w:rPr>
-        <w:t xml:space="preserve"> data are accessed frequently during a user session but updated only when the user performs specific actions. Order and payment data are accessed during checkout, order tracking, and administrative order management. Coupon data is accessed occasionally during checkout for validation purposes.</w:t>
+        <w:t>User data is accessed frequently during login, profile updates, checkout, and order history viewing. Product and category data are among the most frequently accessed entities, as they are continuously retrieved during browsing, searching, and filtering operations. Cart and wishlist data are accessed frequently during a user session but updated only when the user performs specific actions. Order and payment data are accessed during checkout, order tracking, and administrative order management. Coupon data is accessed occasionally during checkout for validation purposes.</w:t>
       </w:r>
     </w:p>
     <w:p>
@@ -38128,6 +36668,7 @@
           <w:sz w:val="24"/>
           <w:szCs w:val="24"/>
         </w:rPr>
+        <w:lastRenderedPageBreak/>
         <w:t>3.7.3 Data Access Capabilities</w:t>
       </w:r>
     </w:p>
@@ -38148,25 +36689,7 @@
           <w:sz w:val="24"/>
           <w:szCs w:val="24"/>
         </w:rPr>
-        <w:t xml:space="preserve">The database supports role-based data access. Users are permitted to access and modify only their own personal data, cart, </w:t>
-      </w:r>
-      <w:proofErr w:type="spellStart"/>
-      <w:r>
-        <w:rPr>
-          <w:rFonts w:asciiTheme="majorBidi" w:eastAsia="Times New Roman" w:hAnsiTheme="majorBidi" w:cstheme="majorBidi"/>
-          <w:sz w:val="24"/>
-          <w:szCs w:val="24"/>
-        </w:rPr>
-        <w:t>wishlist</w:t>
-      </w:r>
-      <w:proofErr w:type="spellEnd"/>
-      <w:r>
-        <w:rPr>
-          <w:rFonts w:asciiTheme="majorBidi" w:eastAsia="Times New Roman" w:hAnsiTheme="majorBidi" w:cstheme="majorBidi"/>
-          <w:sz w:val="24"/>
-          <w:szCs w:val="24"/>
-        </w:rPr>
-        <w:t>, and order history. Admin users have elevated access privileges, allowing them to create, update, and delete product records, manage categories, update inventory, view all orders, and manage user accounts. All database interactions are performed through secured backend services using authenticated and authorized requests to prevent unauthorized access.</w:t>
+        <w:t>The database supports role-based data access. Users are permitted to access and modify only their own personal data, cart, wishlist, and order history. Admin users have elevated access privileges, allowing them to create, update, and delete product records, manage categories, update inventory, view all orders, and manage user accounts. All database interactions are performed through secured backend services using authenticated and authorized requests to prevent unauthorized access.</w:t>
       </w:r>
     </w:p>
     <w:p>
@@ -39593,79 +38116,7 @@
           <w:sz w:val="24"/>
           <w:szCs w:val="24"/>
         </w:rPr>
-        <w:t xml:space="preserve"> Uniquely identify all major entities (</w:t>
-      </w:r>
-      <w:proofErr w:type="spellStart"/>
-      <w:r>
-        <w:rPr>
-          <w:rFonts w:asciiTheme="majorBidi" w:eastAsia="Times New Roman" w:hAnsiTheme="majorBidi" w:cstheme="majorBidi"/>
-          <w:sz w:val="24"/>
-          <w:szCs w:val="24"/>
-        </w:rPr>
-        <w:t>user_id</w:t>
-      </w:r>
-      <w:proofErr w:type="spellEnd"/>
-      <w:r>
-        <w:rPr>
-          <w:rFonts w:asciiTheme="majorBidi" w:eastAsia="Times New Roman" w:hAnsiTheme="majorBidi" w:cstheme="majorBidi"/>
-          <w:sz w:val="24"/>
-          <w:szCs w:val="24"/>
-        </w:rPr>
-        <w:t xml:space="preserve">, </w:t>
-      </w:r>
-      <w:proofErr w:type="spellStart"/>
-      <w:r>
-        <w:rPr>
-          <w:rFonts w:asciiTheme="majorBidi" w:eastAsia="Times New Roman" w:hAnsiTheme="majorBidi" w:cstheme="majorBidi"/>
-          <w:sz w:val="24"/>
-          <w:szCs w:val="24"/>
-        </w:rPr>
-        <w:t>product_id</w:t>
-      </w:r>
-      <w:proofErr w:type="spellEnd"/>
-      <w:r>
-        <w:rPr>
-          <w:rFonts w:asciiTheme="majorBidi" w:eastAsia="Times New Roman" w:hAnsiTheme="majorBidi" w:cstheme="majorBidi"/>
-          <w:sz w:val="24"/>
-          <w:szCs w:val="24"/>
-        </w:rPr>
-        <w:t xml:space="preserve">, </w:t>
-      </w:r>
-      <w:proofErr w:type="spellStart"/>
-      <w:r>
-        <w:rPr>
-          <w:rFonts w:asciiTheme="majorBidi" w:eastAsia="Times New Roman" w:hAnsiTheme="majorBidi" w:cstheme="majorBidi"/>
-          <w:sz w:val="24"/>
-          <w:szCs w:val="24"/>
-        </w:rPr>
-        <w:t>order_id</w:t>
-      </w:r>
-      <w:proofErr w:type="spellEnd"/>
-      <w:r>
-        <w:rPr>
-          <w:rFonts w:asciiTheme="majorBidi" w:eastAsia="Times New Roman" w:hAnsiTheme="majorBidi" w:cstheme="majorBidi"/>
-          <w:sz w:val="24"/>
-          <w:szCs w:val="24"/>
-        </w:rPr>
-        <w:t xml:space="preserve">, </w:t>
-      </w:r>
-      <w:proofErr w:type="spellStart"/>
-      <w:r>
-        <w:rPr>
-          <w:rFonts w:asciiTheme="majorBidi" w:eastAsia="Times New Roman" w:hAnsiTheme="majorBidi" w:cstheme="majorBidi"/>
-          <w:sz w:val="24"/>
-          <w:szCs w:val="24"/>
-        </w:rPr>
-        <w:t>payment_id</w:t>
-      </w:r>
-      <w:proofErr w:type="spellEnd"/>
-      <w:r>
-        <w:rPr>
-          <w:rFonts w:asciiTheme="majorBidi" w:eastAsia="Times New Roman" w:hAnsiTheme="majorBidi" w:cstheme="majorBidi"/>
-          <w:sz w:val="24"/>
-          <w:szCs w:val="24"/>
-        </w:rPr>
-        <w:t>).</w:t>
+        <w:t xml:space="preserve"> Uniquely identify all major entities (user_id, product_id, order_id, payment_id).</w:t>
       </w:r>
     </w:p>
     <w:p>
@@ -39698,99 +38149,7 @@
           <w:sz w:val="24"/>
           <w:szCs w:val="24"/>
         </w:rPr>
-        <w:t xml:space="preserve"> Ensure valid relationships (e.g., </w:t>
-      </w:r>
-      <w:proofErr w:type="spellStart"/>
-      <w:r>
-        <w:rPr>
-          <w:rFonts w:asciiTheme="majorBidi" w:eastAsia="Times New Roman" w:hAnsiTheme="majorBidi" w:cstheme="majorBidi"/>
-          <w:sz w:val="24"/>
-          <w:szCs w:val="24"/>
-        </w:rPr>
-        <w:t>order.user_id</w:t>
-      </w:r>
-      <w:proofErr w:type="spellEnd"/>
-      <w:r>
-        <w:rPr>
-          <w:rFonts w:asciiTheme="majorBidi" w:eastAsia="Times New Roman" w:hAnsiTheme="majorBidi" w:cstheme="majorBidi"/>
-          <w:sz w:val="24"/>
-          <w:szCs w:val="24"/>
-        </w:rPr>
-        <w:t xml:space="preserve"> references </w:t>
-      </w:r>
-      <w:proofErr w:type="spellStart"/>
-      <w:r>
-        <w:rPr>
-          <w:rFonts w:asciiTheme="majorBidi" w:eastAsia="Times New Roman" w:hAnsiTheme="majorBidi" w:cstheme="majorBidi"/>
-          <w:sz w:val="24"/>
-          <w:szCs w:val="24"/>
-        </w:rPr>
-        <w:t>user.user_id</w:t>
-      </w:r>
-      <w:proofErr w:type="spellEnd"/>
-      <w:r>
-        <w:rPr>
-          <w:rFonts w:asciiTheme="majorBidi" w:eastAsia="Times New Roman" w:hAnsiTheme="majorBidi" w:cstheme="majorBidi"/>
-          <w:sz w:val="24"/>
-          <w:szCs w:val="24"/>
-        </w:rPr>
-        <w:t xml:space="preserve">, </w:t>
-      </w:r>
-      <w:proofErr w:type="spellStart"/>
-      <w:proofErr w:type="gramStart"/>
-      <w:r>
-        <w:rPr>
-          <w:rFonts w:asciiTheme="majorBidi" w:eastAsia="Times New Roman" w:hAnsiTheme="majorBidi" w:cstheme="majorBidi"/>
-          <w:sz w:val="24"/>
-          <w:szCs w:val="24"/>
-        </w:rPr>
-        <w:t>orderitem.product</w:t>
-      </w:r>
-      <w:proofErr w:type="gramEnd"/>
-      <w:r>
-        <w:rPr>
-          <w:rFonts w:asciiTheme="majorBidi" w:eastAsia="Times New Roman" w:hAnsiTheme="majorBidi" w:cstheme="majorBidi"/>
-          <w:sz w:val="24"/>
-          <w:szCs w:val="24"/>
-        </w:rPr>
-        <w:t>_id</w:t>
-      </w:r>
-      <w:proofErr w:type="spellEnd"/>
-      <w:r>
-        <w:rPr>
-          <w:rFonts w:asciiTheme="majorBidi" w:eastAsia="Times New Roman" w:hAnsiTheme="majorBidi" w:cstheme="majorBidi"/>
-          <w:sz w:val="24"/>
-          <w:szCs w:val="24"/>
-        </w:rPr>
-        <w:t xml:space="preserve"> references </w:t>
-      </w:r>
-      <w:proofErr w:type="spellStart"/>
-      <w:proofErr w:type="gramStart"/>
-      <w:r>
-        <w:rPr>
-          <w:rFonts w:asciiTheme="majorBidi" w:eastAsia="Times New Roman" w:hAnsiTheme="majorBidi" w:cstheme="majorBidi"/>
-          <w:sz w:val="24"/>
-          <w:szCs w:val="24"/>
-        </w:rPr>
-        <w:t>product.product</w:t>
-      </w:r>
-      <w:proofErr w:type="gramEnd"/>
-      <w:r>
-        <w:rPr>
-          <w:rFonts w:asciiTheme="majorBidi" w:eastAsia="Times New Roman" w:hAnsiTheme="majorBidi" w:cstheme="majorBidi"/>
-          <w:sz w:val="24"/>
-          <w:szCs w:val="24"/>
-        </w:rPr>
-        <w:t>_id</w:t>
-      </w:r>
-      <w:proofErr w:type="spellEnd"/>
-      <w:r>
-        <w:rPr>
-          <w:rFonts w:asciiTheme="majorBidi" w:eastAsia="Times New Roman" w:hAnsiTheme="majorBidi" w:cstheme="majorBidi"/>
-          <w:sz w:val="24"/>
-          <w:szCs w:val="24"/>
-        </w:rPr>
-        <w:t>).</w:t>
+        <w:t xml:space="preserve"> Ensure valid relationships (e.g., order.user_id references user.user_id, orderitem.product_id references product.product_id).</w:t>
       </w:r>
     </w:p>
     <w:p>
@@ -39823,47 +38182,7 @@
           <w:sz w:val="24"/>
           <w:szCs w:val="24"/>
         </w:rPr>
-        <w:t xml:space="preserve"> Enforce uniqueness on fields like </w:t>
-      </w:r>
-      <w:proofErr w:type="spellStart"/>
-      <w:proofErr w:type="gramStart"/>
-      <w:r>
-        <w:rPr>
-          <w:rFonts w:asciiTheme="majorBidi" w:eastAsia="Times New Roman" w:hAnsiTheme="majorBidi" w:cstheme="majorBidi"/>
-          <w:sz w:val="24"/>
-          <w:szCs w:val="24"/>
-        </w:rPr>
-        <w:t>user.email</w:t>
-      </w:r>
-      <w:proofErr w:type="spellEnd"/>
-      <w:proofErr w:type="gramEnd"/>
-      <w:r>
-        <w:rPr>
-          <w:rFonts w:asciiTheme="majorBidi" w:eastAsia="Times New Roman" w:hAnsiTheme="majorBidi" w:cstheme="majorBidi"/>
-          <w:sz w:val="24"/>
-          <w:szCs w:val="24"/>
-        </w:rPr>
-        <w:t xml:space="preserve"> and </w:t>
-      </w:r>
-      <w:proofErr w:type="spellStart"/>
-      <w:proofErr w:type="gramStart"/>
-      <w:r>
-        <w:rPr>
-          <w:rFonts w:asciiTheme="majorBidi" w:eastAsia="Times New Roman" w:hAnsiTheme="majorBidi" w:cstheme="majorBidi"/>
-          <w:sz w:val="24"/>
-          <w:szCs w:val="24"/>
-        </w:rPr>
-        <w:t>coupon.code</w:t>
-      </w:r>
-      <w:proofErr w:type="spellEnd"/>
-      <w:proofErr w:type="gramEnd"/>
-      <w:r>
-        <w:rPr>
-          <w:rFonts w:asciiTheme="majorBidi" w:eastAsia="Times New Roman" w:hAnsiTheme="majorBidi" w:cstheme="majorBidi"/>
-          <w:sz w:val="24"/>
-          <w:szCs w:val="24"/>
-        </w:rPr>
-        <w:t>.</w:t>
+        <w:t xml:space="preserve"> Enforce uniqueness on fields like user.email and coupon.code.</w:t>
       </w:r>
     </w:p>
     <w:p>
@@ -40033,25 +38352,7 @@
           <w:sz w:val="24"/>
           <w:szCs w:val="24"/>
         </w:rPr>
-        <w:t xml:space="preserve">User account data, order history, and payment records shall be retained indefinitely unless explicitly deleted due to legal, regulatory, or administrative requirements. Cart and </w:t>
-      </w:r>
-      <w:proofErr w:type="spellStart"/>
-      <w:r>
-        <w:rPr>
-          <w:rFonts w:asciiTheme="majorBidi" w:eastAsia="Times New Roman" w:hAnsiTheme="majorBidi" w:cstheme="majorBidi"/>
-          <w:sz w:val="24"/>
-          <w:szCs w:val="24"/>
-        </w:rPr>
-        <w:t>wishlist</w:t>
-      </w:r>
-      <w:proofErr w:type="spellEnd"/>
-      <w:r>
-        <w:rPr>
-          <w:rFonts w:asciiTheme="majorBidi" w:eastAsia="Times New Roman" w:hAnsiTheme="majorBidi" w:cstheme="majorBidi"/>
-          <w:sz w:val="24"/>
-          <w:szCs w:val="24"/>
-        </w:rPr>
-        <w:t xml:space="preserve"> data may be cleared automatically after prolonged periods of user inactivity. Backup copies of the database are retained according to the system’s backup policy to support disaster recovery. Sensitive data such as passwords is stored in encrypted or hashed form and is never retained in plain text.</w:t>
+        <w:t>User account data, order history, and payment records shall be retained indefinitely unless explicitly deleted due to legal, regulatory, or administrative requirements. Cart and wishlist data may be cleared automatically after prolonged periods of user inactivity. Backup copies of the database are retained according to the system’s backup policy to support disaster recovery. Sensitive data such as passwords is stored in encrypted or hashed form and is never retained in plain text.</w:t>
       </w:r>
     </w:p>
     <w:p>
@@ -40119,7 +38420,7 @@
                     <pic:cNvPicPr/>
                   </pic:nvPicPr>
                   <pic:blipFill>
-                    <a:blip r:embed="rId57"/>
+                    <a:blip r:embed="rId58"/>
                     <a:stretch>
                       <a:fillRect/>
                     </a:stretch>
@@ -40158,7 +38459,7 @@
           <w:rPr>
             <w:noProof/>
           </w:rPr>
-          <w:t>47</w:t>
+          <w:t>48</w:t>
         </w:r>
       </w:fldSimple>
       <w:r>
@@ -40307,25 +38608,7 @@
           <w:sz w:val="24"/>
           <w:szCs w:val="24"/>
         </w:rPr>
-        <w:t xml:space="preserve">Security requirements impose strict constraints on system design. All user authentication mechanisms must comply with industry best practices, including password hashing using </w:t>
-      </w:r>
-      <w:proofErr w:type="spellStart"/>
-      <w:r>
-        <w:rPr>
-          <w:rFonts w:asciiTheme="majorBidi" w:eastAsia="Times New Roman" w:hAnsiTheme="majorBidi" w:cstheme="majorBidi"/>
-          <w:sz w:val="24"/>
-          <w:szCs w:val="24"/>
-        </w:rPr>
-        <w:t>bcrypt</w:t>
-      </w:r>
-      <w:proofErr w:type="spellEnd"/>
-      <w:r>
-        <w:rPr>
-          <w:rFonts w:asciiTheme="majorBidi" w:eastAsia="Times New Roman" w:hAnsiTheme="majorBidi" w:cstheme="majorBidi"/>
-          <w:sz w:val="24"/>
-          <w:szCs w:val="24"/>
-        </w:rPr>
-        <w:t xml:space="preserve"> or equivalent algorithms and encrypted communication using SSL/TLS. Administrative access must support two-factor authentication, limiting design choices for authentication frameworks and identity management solutions.</w:t>
+        <w:t>Security requirements impose strict constraints on system design. All user authentication mechanisms must comply with industry best practices, including password hashing using bcrypt or equivalent algorithms and encrypted communication using SSL/TLS. Administrative access must support two-factor authentication, limiting design choices for authentication frameworks and identity management solutions.</w:t>
       </w:r>
     </w:p>
     <w:p>
@@ -40564,21 +38847,12 @@
       <w:bookmarkStart w:id="35" w:name="_Toc506458810"/>
       <w:bookmarkStart w:id="36" w:name="_Toc506459176"/>
       <w:bookmarkStart w:id="37" w:name="_Toc216737983"/>
-      <w:proofErr w:type="gramStart"/>
       <w:r>
         <w:rPr>
           <w:sz w:val="28"/>
           <w:szCs w:val="28"/>
         </w:rPr>
-        <w:t>4.1  Sequence</w:t>
-      </w:r>
-      <w:proofErr w:type="gramEnd"/>
-      <w:r>
-        <w:rPr>
-          <w:sz w:val="28"/>
-          <w:szCs w:val="28"/>
-        </w:rPr>
-        <w:t xml:space="preserve"> Diagrams</w:t>
+        <w:t>4.1  Sequence Diagrams</w:t>
       </w:r>
       <w:bookmarkEnd w:id="35"/>
       <w:bookmarkEnd w:id="36"/>
@@ -40745,7 +39019,7 @@
                     </pic:cNvPicPr>
                   </pic:nvPicPr>
                   <pic:blipFill rotWithShape="1">
-                    <a:blip r:embed="rId58">
+                    <a:blip r:embed="rId59">
                       <a:extLst>
                         <a:ext uri="{28A0092B-C50C-407E-A947-70E740481C1C}">
                           <a14:useLocalDpi xmlns:a14="http://schemas.microsoft.com/office/drawing/2010/main" val="0"/>
@@ -40802,7 +39076,7 @@
           <w:rPr>
             <w:noProof/>
           </w:rPr>
-          <w:t>48</w:t>
+          <w:t>49</w:t>
         </w:r>
       </w:fldSimple>
       <w:r>
@@ -40965,7 +39239,7 @@
                     </pic:cNvPicPr>
                   </pic:nvPicPr>
                   <pic:blipFill rotWithShape="1">
-                    <a:blip r:embed="rId59">
+                    <a:blip r:embed="rId60">
                       <a:extLst>
                         <a:ext uri="{28A0092B-C50C-407E-A947-70E740481C1C}">
                           <a14:useLocalDpi xmlns:a14="http://schemas.microsoft.com/office/drawing/2010/main" val="0"/>
@@ -41015,7 +39289,7 @@
           <w:rPr>
             <w:noProof/>
           </w:rPr>
-          <w:t>49</w:t>
+          <w:t>50</w:t>
         </w:r>
       </w:fldSimple>
       <w:r>
@@ -41168,7 +39442,7 @@
                     </pic:cNvPicPr>
                   </pic:nvPicPr>
                   <pic:blipFill rotWithShape="1">
-                    <a:blip r:embed="rId60">
+                    <a:blip r:embed="rId61">
                       <a:extLst>
                         <a:ext uri="{28A0092B-C50C-407E-A947-70E740481C1C}">
                           <a14:useLocalDpi xmlns:a14="http://schemas.microsoft.com/office/drawing/2010/main" val="0"/>
@@ -41225,7 +39499,7 @@
           <w:rPr>
             <w:noProof/>
           </w:rPr>
-          <w:t>50</w:t>
+          <w:t>51</w:t>
         </w:r>
       </w:fldSimple>
       <w:r>
@@ -41380,7 +39654,7 @@
                     </pic:cNvPicPr>
                   </pic:nvPicPr>
                   <pic:blipFill rotWithShape="1">
-                    <a:blip r:embed="rId61">
+                    <a:blip r:embed="rId62">
                       <a:extLst>
                         <a:ext uri="{28A0092B-C50C-407E-A947-70E740481C1C}">
                           <a14:useLocalDpi xmlns:a14="http://schemas.microsoft.com/office/drawing/2010/main" val="0"/>
@@ -41437,7 +39711,7 @@
           <w:rPr>
             <w:noProof/>
           </w:rPr>
-          <w:t>51</w:t>
+          <w:t>52</w:t>
         </w:r>
       </w:fldSimple>
       <w:r>
@@ -41601,7 +39875,7 @@
                     </pic:cNvPicPr>
                   </pic:nvPicPr>
                   <pic:blipFill rotWithShape="1">
-                    <a:blip r:embed="rId62">
+                    <a:blip r:embed="rId63">
                       <a:extLst>
                         <a:ext uri="{28A0092B-C50C-407E-A947-70E740481C1C}">
                           <a14:useLocalDpi xmlns:a14="http://schemas.microsoft.com/office/drawing/2010/main" val="0"/>
@@ -41658,7 +39932,7 @@
           <w:rPr>
             <w:noProof/>
           </w:rPr>
-          <w:t>52</w:t>
+          <w:t>53</w:t>
         </w:r>
       </w:fldSimple>
       <w:r>
@@ -41808,7 +40082,7 @@
                     </pic:cNvPicPr>
                   </pic:nvPicPr>
                   <pic:blipFill rotWithShape="1">
-                    <a:blip r:embed="rId63">
+                    <a:blip r:embed="rId64">
                       <a:extLst>
                         <a:ext uri="{28A0092B-C50C-407E-A947-70E740481C1C}">
                           <a14:useLocalDpi xmlns:a14="http://schemas.microsoft.com/office/drawing/2010/main" val="0"/>
@@ -41858,7 +40132,7 @@
           <w:rPr>
             <w:noProof/>
           </w:rPr>
-          <w:t>53</w:t>
+          <w:t>54</w:t>
         </w:r>
       </w:fldSimple>
       <w:r>
@@ -41993,7 +40267,7 @@
                     </pic:cNvPicPr>
                   </pic:nvPicPr>
                   <pic:blipFill rotWithShape="1">
-                    <a:blip r:embed="rId64">
+                    <a:blip r:embed="rId65">
                       <a:extLst>
                         <a:ext uri="{28A0092B-C50C-407E-A947-70E740481C1C}">
                           <a14:useLocalDpi xmlns:a14="http://schemas.microsoft.com/office/drawing/2010/main" val="0"/>
@@ -42047,7 +40321,7 @@
           <w:rPr>
             <w:noProof/>
           </w:rPr>
-          <w:t>54</w:t>
+          <w:t>55</w:t>
         </w:r>
       </w:fldSimple>
       <w:r>
@@ -42193,7 +40467,7 @@
                     </pic:cNvPicPr>
                   </pic:nvPicPr>
                   <pic:blipFill rotWithShape="1">
-                    <a:blip r:embed="rId65">
+                    <a:blip r:embed="rId66">
                       <a:extLst>
                         <a:ext uri="{28A0092B-C50C-407E-A947-70E740481C1C}">
                           <a14:useLocalDpi xmlns:a14="http://schemas.microsoft.com/office/drawing/2010/main" val="0"/>
@@ -42243,7 +40517,7 @@
           <w:rPr>
             <w:noProof/>
           </w:rPr>
-          <w:t>55</w:t>
+          <w:t>56</w:t>
         </w:r>
       </w:fldSimple>
       <w:r>
@@ -42385,7 +40659,7 @@
                     </pic:cNvPicPr>
                   </pic:nvPicPr>
                   <pic:blipFill rotWithShape="1">
-                    <a:blip r:embed="rId66">
+                    <a:blip r:embed="rId67">
                       <a:extLst>
                         <a:ext uri="{28A0092B-C50C-407E-A947-70E740481C1C}">
                           <a14:useLocalDpi xmlns:a14="http://schemas.microsoft.com/office/drawing/2010/main" val="0"/>
@@ -42435,7 +40709,7 @@
           <w:rPr>
             <w:noProof/>
           </w:rPr>
-          <w:t>56</w:t>
+          <w:t>57</w:t>
         </w:r>
       </w:fldSimple>
       <w:r>
@@ -42585,7 +40859,7 @@
                     </pic:cNvPicPr>
                   </pic:nvPicPr>
                   <pic:blipFill rotWithShape="1">
-                    <a:blip r:embed="rId67">
+                    <a:blip r:embed="rId68">
                       <a:extLst>
                         <a:ext uri="{28A0092B-C50C-407E-A947-70E740481C1C}">
                           <a14:useLocalDpi xmlns:a14="http://schemas.microsoft.com/office/drawing/2010/main" val="0"/>
@@ -42635,7 +40909,7 @@
           <w:rPr>
             <w:noProof/>
           </w:rPr>
-          <w:t>57</w:t>
+          <w:t>58</w:t>
         </w:r>
       </w:fldSimple>
       <w:r>
@@ -42664,21 +40938,12 @@
         </w:rPr>
       </w:pPr>
       <w:bookmarkStart w:id="40" w:name="_Toc216737984"/>
-      <w:proofErr w:type="gramStart"/>
       <w:r>
         <w:rPr>
           <w:sz w:val="28"/>
           <w:szCs w:val="28"/>
         </w:rPr>
-        <w:t>4.2  Data</w:t>
-      </w:r>
-      <w:proofErr w:type="gramEnd"/>
-      <w:r>
-        <w:rPr>
-          <w:sz w:val="28"/>
-          <w:szCs w:val="28"/>
-        </w:rPr>
-        <w:t xml:space="preserve"> Flow Diagrams (DFD)</w:t>
+        <w:t>4.2  Data Flow Diagrams (DFD)</w:t>
       </w:r>
       <w:bookmarkEnd w:id="38"/>
       <w:bookmarkEnd w:id="39"/>
@@ -42756,25 +41021,7 @@
           <w:sz w:val="24"/>
           <w:szCs w:val="24"/>
         </w:rPr>
-        <w:t xml:space="preserve">The User interacts with the system to perform activities such as registration, login, browsing products, placing orders, and making payments. The </w:t>
-      </w:r>
-      <w:proofErr w:type="gramStart"/>
-      <w:r>
-        <w:rPr>
-          <w:rFonts w:asciiTheme="majorBidi" w:hAnsiTheme="majorBidi" w:cstheme="majorBidi"/>
-          <w:sz w:val="24"/>
-          <w:szCs w:val="24"/>
-        </w:rPr>
-        <w:t>Admin</w:t>
-      </w:r>
-      <w:proofErr w:type="gramEnd"/>
-      <w:r>
-        <w:rPr>
-          <w:rFonts w:asciiTheme="majorBidi" w:hAnsiTheme="majorBidi" w:cstheme="majorBidi"/>
-          <w:sz w:val="24"/>
-          <w:szCs w:val="24"/>
-        </w:rPr>
-        <w:t xml:space="preserve"> interacts with the system to manage products and orders. The system communicates with the Payment Gateway to process payments and receive payment status information.</w:t>
+        <w:t>The User interacts with the system to perform activities such as registration, login, browsing products, placing orders, and making payments. The Admin interacts with the system to manage products and orders. The system communicates with the Payment Gateway to process payments and receive payment status information.</w:t>
       </w:r>
     </w:p>
     <w:p>
@@ -42806,7 +41053,7 @@
                     <pic:cNvPicPr/>
                   </pic:nvPicPr>
                   <pic:blipFill>
-                    <a:blip r:embed="rId68"/>
+                    <a:blip r:embed="rId69"/>
                     <a:stretch>
                       <a:fillRect/>
                     </a:stretch>
@@ -42845,7 +41092,7 @@
           <w:rPr>
             <w:noProof/>
           </w:rPr>
-          <w:t>58</w:t>
+          <w:t>59</w:t>
         </w:r>
       </w:fldSimple>
       <w:r>
@@ -42949,7 +41196,7 @@
                     <pic:cNvPicPr/>
                   </pic:nvPicPr>
                   <pic:blipFill>
-                    <a:blip r:embed="rId69"/>
+                    <a:blip r:embed="rId70"/>
                     <a:stretch>
                       <a:fillRect/>
                     </a:stretch>
@@ -42988,7 +41235,7 @@
           <w:rPr>
             <w:noProof/>
           </w:rPr>
-          <w:t>59</w:t>
+          <w:t>60</w:t>
         </w:r>
       </w:fldSimple>
       <w:r>
@@ -43307,21 +41554,12 @@
       <w:bookmarkStart w:id="41" w:name="_Toc506458812"/>
       <w:bookmarkStart w:id="42" w:name="_Toc506459178"/>
       <w:bookmarkStart w:id="43" w:name="_Toc216737985"/>
-      <w:proofErr w:type="gramStart"/>
       <w:r>
         <w:rPr>
           <w:sz w:val="28"/>
           <w:szCs w:val="28"/>
         </w:rPr>
-        <w:t>4.3  State</w:t>
-      </w:r>
-      <w:proofErr w:type="gramEnd"/>
-      <w:r>
-        <w:rPr>
-          <w:sz w:val="28"/>
-          <w:szCs w:val="28"/>
-        </w:rPr>
-        <w:t>-Transition Diagrams (STD)</w:t>
+        <w:t>4.3  State-Transition Diagrams (STD)</w:t>
       </w:r>
       <w:bookmarkEnd w:id="41"/>
       <w:bookmarkEnd w:id="42"/>
@@ -43442,7 +41680,7 @@
                     </pic:cNvPicPr>
                   </pic:nvPicPr>
                   <pic:blipFill rotWithShape="1">
-                    <a:blip r:embed="rId70">
+                    <a:blip r:embed="rId71">
                       <a:extLst>
                         <a:ext uri="{28A0092B-C50C-407E-A947-70E740481C1C}">
                           <a14:useLocalDpi xmlns:a14="http://schemas.microsoft.com/office/drawing/2010/main" val="0"/>
@@ -43497,7 +41735,7 @@
           <w:rPr>
             <w:noProof/>
           </w:rPr>
-          <w:t>60</w:t>
+          <w:t>61</w:t>
         </w:r>
       </w:fldSimple>
       <w:r>
@@ -43593,7 +41831,7 @@
                     </pic:cNvPicPr>
                   </pic:nvPicPr>
                   <pic:blipFill rotWithShape="1">
-                    <a:blip r:embed="rId71">
+                    <a:blip r:embed="rId72">
                       <a:extLst>
                         <a:ext uri="{28A0092B-C50C-407E-A947-70E740481C1C}">
                           <a14:useLocalDpi xmlns:a14="http://schemas.microsoft.com/office/drawing/2010/main" val="0"/>
@@ -43643,7 +41881,7 @@
           <w:rPr>
             <w:noProof/>
           </w:rPr>
-          <w:t>61</w:t>
+          <w:t>62</w:t>
         </w:r>
       </w:fldSimple>
       <w:r>
@@ -43744,7 +41982,7 @@
                     </pic:cNvPicPr>
                   </pic:nvPicPr>
                   <pic:blipFill rotWithShape="1">
-                    <a:blip r:embed="rId72">
+                    <a:blip r:embed="rId73">
                       <a:extLst>
                         <a:ext uri="{28A0092B-C50C-407E-A947-70E740481C1C}">
                           <a14:useLocalDpi xmlns:a14="http://schemas.microsoft.com/office/drawing/2010/main" val="0"/>
@@ -43795,7 +42033,7 @@
           <w:rPr>
             <w:noProof/>
           </w:rPr>
-          <w:t>62</w:t>
+          <w:t>63</w:t>
         </w:r>
       </w:fldSimple>
       <w:r>
@@ -43903,7 +42141,7 @@
                     </pic:cNvPicPr>
                   </pic:nvPicPr>
                   <pic:blipFill rotWithShape="1">
-                    <a:blip r:embed="rId73">
+                    <a:blip r:embed="rId74">
                       <a:extLst>
                         <a:ext uri="{28A0092B-C50C-407E-A947-70E740481C1C}">
                           <a14:useLocalDpi xmlns:a14="http://schemas.microsoft.com/office/drawing/2010/main" val="0"/>
@@ -43958,7 +42196,7 @@
           <w:rPr>
             <w:noProof/>
           </w:rPr>
-          <w:t>63</w:t>
+          <w:t>64</w:t>
         </w:r>
       </w:fldSimple>
       <w:r>
@@ -44065,7 +42303,7 @@
                     </pic:cNvPicPr>
                   </pic:nvPicPr>
                   <pic:blipFill rotWithShape="1">
-                    <a:blip r:embed="rId74">
+                    <a:blip r:embed="rId75">
                       <a:extLst>
                         <a:ext uri="{28A0092B-C50C-407E-A947-70E740481C1C}">
                           <a14:useLocalDpi xmlns:a14="http://schemas.microsoft.com/office/drawing/2010/main" val="0"/>
@@ -44120,7 +42358,7 @@
           <w:rPr>
             <w:noProof/>
           </w:rPr>
-          <w:t>64</w:t>
+          <w:t>65</w:t>
         </w:r>
       </w:fldSimple>
       <w:r>
@@ -44225,7 +42463,7 @@
                     </pic:cNvPicPr>
                   </pic:nvPicPr>
                   <pic:blipFill rotWithShape="1">
-                    <a:blip r:embed="rId75">
+                    <a:blip r:embed="rId76">
                       <a:extLst>
                         <a:ext uri="{28A0092B-C50C-407E-A947-70E740481C1C}">
                           <a14:useLocalDpi xmlns:a14="http://schemas.microsoft.com/office/drawing/2010/main" val="0"/>
@@ -44275,7 +42513,7 @@
           <w:rPr>
             <w:noProof/>
           </w:rPr>
-          <w:t>65</w:t>
+          <w:t>66</w:t>
         </w:r>
       </w:fldSimple>
       <w:r>
@@ -44482,7 +42720,7 @@
       </w:pPr>
     </w:p>
     <w:sectPr>
-      <w:footerReference w:type="default" r:id="rId76"/>
+      <w:footerReference w:type="default" r:id="rId77"/>
       <w:pgSz w:w="12240" w:h="15840"/>
       <w:pgMar w:top="1440" w:right="1440" w:bottom="1440" w:left="1440" w:header="720" w:footer="720" w:gutter="0"/>
       <w:pgNumType w:start="1"/>
@@ -44814,7 +43052,7 @@
             <w:noProof/>
             <w:sz w:val="18"/>
           </w:rPr>
-          <w:t>12/16/25</w:t>
+          <w:t>02/19/26</w:t>
         </w:r>
         <w:r>
           <w:rPr>
@@ -58205,7 +56443,7 @@
   <w:style w:type="paragraph" w:default="1" w:styleId="Normal">
     <w:name w:val="Normal"/>
     <w:qFormat/>
-    <w:rsid w:val="000A0ED8"/>
+    <w:rsid w:val="00D63C0D"/>
   </w:style>
   <w:style w:type="paragraph" w:styleId="Heading1">
     <w:name w:val="heading 1"/>

</xml_diff>